<commit_message>
updated methods and results write up
</commit_message>
<xml_diff>
--- a/analysis/paper/Methods_Results.docx
+++ b/analysis/paper/Methods_Results.docx
@@ -316,7 +316,13 @@
         <w:pStyle w:val="BodyText"/>
       </w:pPr>
       <w:r>
-        <w:t>Differences in local rearing habitat within the Tucannon may also contribute to differences in smolts per spawner because of how redds can be distributed across the watershed. The hatchery weir on the Tucannon is located at rkm 59, and may impact adult passage through delays, etc. (Wilson and Buehrens 2024). The habitat in the upper watershed is more pristine while the habitat in the lower watershed is more heavily impacted. Because many summary statistics describing these phenomenon (e.g., proportion of redds above/below the weir, proportion in the upper watershed, proportion in the lower watershed, etc.) are highly correlated, we chose to examine the mean rkm of the redds each year as a singular covariate that describes many of these general patterns. We hypothesize that the greater the mean redd rkm (i.e., due to more redds higher in the watershed, towards better habitat and above the weir), the greater smolts per spawner will be observed. We also included as a covariate the standard deviation of the redd rkms, as a measure of how concentrated (small value) or dispersed (high value) the redds were within the watershed in a given year.</w:t>
+        <w:t>Differences in local rearing habitat within the Tucannon may also contribute to differences in smolts per spawner because of how redds can be distributed across the watershed. The hatchery weir on the Tucannon is located at rkm 59, and may impact adult passage through delays, etc. (Wilson and Buehrens 2024). The habitat in the upper watershed is more pristine while the habitat in the lower watershed is more heavily impacted. Because many summary statistics describing these phenomenon (e.g., proportion of re</w:t>
+      </w:r>
+      <w:r>
+        <w:t xml:space="preserve">dds above/below the weir, proportion in the upper watershed, proportion in the lower watershed, etc.) are highly correlated, we chose to examine the mean rkm of the redds each year as a singular covariate that describes many of these general patterns. We hypothesize that the greater the mean redd rkm (i.e., due to more redds higher in the watershed, towards better habitat and above the weir), the greater smolts per spawner will be observed. We also included as a covariate the standard deviation of the redd </w:t>
+      </w:r>
+      <w:r>
+        <w:t>rkms, as a measure of how concentrated (small value) or dispersed (high value) the redds were within the watershed in a given year.</w:t>
       </w:r>
     </w:p>
     <w:tbl>
@@ -1964,7 +1970,13 @@
         <w:pStyle w:val="FirstParagraph"/>
       </w:pPr>
       <w:r>
-        <w:t>To examine the effects of these covariates on smolts per spawner, we fit a generalized additive model (GAM), using the log of smolts per spawner as the dependent variable, and spline terms for mean rkm of redds, standard deviation of rkm per redds, pHOS, and emigration year. The inclusion of emigration year helps to control for long-term trends and effects that are not accounted for by the other covariates. We used a GAM to allow for the possibility of non-linear relationships between the independent variables and productivity. We also included two fixed terms: the number of spawners and an interaction between pHOS and the proportion of out-of-basin strays. The inclusion of spawners as a fixed term assumes a linear relationship between the log of smolts per spawner and the total number of spawners, which implies a Ricker-like carrying capacity. We made this choice because every ecological system is subject to some carrying capacity constraints (Chapman and Byron 2018), and the linearized Ricker model is a common and easily implemented method to incorporate that, while allowing us to allocate more degrees of freedom to the splines of the other covariates.</w:t>
+        <w:t>To examine the effects of these covariates on smolts per spawner, we fit a generalized additive model (GAM), using the log of smolts per spawner as the dependent variable, and spline terms for mean rkm of redds, standard deviation of rkm per redds, pHOS, and emigration year. The inclusion of emigration year helps to control for long-term trends and effects that are not accounted for by the other covariates. We used a GAM to allow for the possibility of non-linear relationships between the independent variab</w:t>
+      </w:r>
+      <w:r>
+        <w:t>les and productivity. We also included two fixed terms: the number of spawners and an interaction between pHOS and the proportion of out-of-basin strays. The inclusion of spawners as a fixed term assumes a linear relationship between the log of smolts per spawner and the total number of spawners, which implies a Ricker-like carrying capacity. We made this choice because every ecological system is subject to some carrying capacity constraints (Chapman and Byron 2018), and the linearized Ricker model is a com</w:t>
+      </w:r>
+      <w:r>
+        <w:t>mon and easily implemented method to incorporate that, while allowing us to allocate more degrees of freedom to the splines of the other covariates.</w:t>
       </w:r>
     </w:p>
     <w:p>
@@ -1972,7 +1984,10 @@
         <w:pStyle w:val="BodyText"/>
       </w:pPr>
       <w:r>
-        <w:t>We also examined the effects of mean smolt length and pHOS on productivity by fitting two more GAMs using total (Age 3+) SAR and R/S as the dependent variables. We included splines for the covariates of the mean smolt length of each brood year and pHOS, as well as brood year. The SAR model was fit using a quasibinomial GAM with a logit link function because the SARs are proportions, whereas for the R/S model, we used a linear GAM with a log link function and also included spawners as a linear parametric covariate, to make this model a linearized Ricker model.</w:t>
+        <w:t>We also examined the effects of mean smolt length and pHOS on productivity by fitting two more GAMs using total (Age 3+) SAR and R/S as the dependent variables. We included splines for the covariates of the mean smolt length of each brood year and pHOS, as well as brood year. The SAR model was fit using a quasibinomial GAM with a logit link function because the SARs are proportions, whereas for the R/S model, we used a linear GAM with a log link function and also included spawners as a linear parametric cov</w:t>
+      </w:r>
+      <w:r>
+        <w:t>ariate, to make this model a linearized Ricker model.</w:t>
       </w:r>
     </w:p>
     <w:p>
@@ -1980,7 +1995,13 @@
         <w:pStyle w:val="BodyText"/>
       </w:pPr>
       <w:r>
-        <w:t>Our goal with these analyses is to examine general patterns of how a few covariates affect the population’s productivity, not necessarily test hypotheses or predict future productivity. The dataset has 35 data points; therefore, we limited the number of knots in all splines to a maximum of four for all covariates except emigration or brood year, which we allowed to be larger as that term was meant to capture any other processes and long-term trends. We fit a spline for year, rather than treating year as a random effect, because we expected the effects to be auto-correlated and to capture any long-term trend. The model was fit using R statistical software version 4.3.2 (R Core Team 2023) with the mgcv package, using restricted maximum likelihood methods. We checked the effective degrees of freedom in each model fit using the “k.check()” function to ensure against underfitting, while the use of penalized splines guarded against overfitting. Data and code to reproduce this analysis is available on a GitHub repository (https://zenodo.org/records/17957317).</w:t>
+        <w:t>Our goal with these analyses is to examine general patterns of how a few covariates affect the population’s productivity, not necessarily test hypotheses or predict future productivity. The dataset has 35 data points; therefore, we limited the number of knots in all splines to a maximum of four for all covariates except emigration or brood year, which we allowed to be larger as that term was meant to capture any other processes and long-term trends. We fit a spline for year, rather than treating year as a r</w:t>
+      </w:r>
+      <w:r>
+        <w:t>andom effect, because we expected the effects to be auto-correlated and to capture any long-term trend. The model was fit using R statistical software version 4.3.2 (R Core Team 2023) with the mgcv package, using restricted maximum likelihood methods. We checked the effective degrees of freedom in each model fit using the “k.check()” function to ensure against underfitting, while the use of penalized splines guarded against overfitting. Data and code to reproduce this analysis is available on a GitHub repos</w:t>
+      </w:r>
+      <w:r>
+        <w:t>itory (https://zenodo.org/records/17957317).</w:t>
       </w:r>
     </w:p>
     <w:p>
@@ -5360,7 +5381,10 @@
       </w:r>
       <w:r>
         <w:lastRenderedPageBreak/>
-        <w:t>higher productivity, although when hatchery origin spawners are made up of a higher proportion of out-of-basin strays, that effect is dampened. The estimated smolt capacity, based on the fitted Ricker curve (</w:t>
+        <w:t>higher productivity, although when hatchery origin spawners are made up of</w:t>
+      </w:r>
+      <w:r>
+        <w:t xml:space="preserve"> a higher proportion of out-of-basin strays, that effect is dampened. The estimated smolt capacity, based on the fitted Ricker curve (</w:t>
       </w:r>
       <w:hyperlink w:anchor="fig-prod-marg">
         <w:r>
@@ -5400,8 +5424,8 @@
                 <w:noProof/>
               </w:rPr>
               <w:drawing>
-                <wp:inline distT="0" distB="0" distL="0" distR="0" wp14:anchorId="55F92A37" wp14:editId="55F92A38">
-                  <wp:extent cx="5334000" cy="6223000"/>
+                <wp:inline distT="0" distB="0" distL="0" distR="0" wp14:anchorId="55F92A37" wp14:editId="30CB9C9C">
+                  <wp:extent cx="5334000" cy="5334000"/>
                   <wp:effectExtent l="0" t="0" r="0" b="0"/>
                   <wp:docPr id="33" name="Picture"/>
                   <wp:cNvGraphicFramePr/>
@@ -5409,13 +5433,19 @@
                     <a:graphicData uri="http://schemas.openxmlformats.org/drawingml/2006/picture">
                       <pic:pic xmlns:pic="http://schemas.openxmlformats.org/drawingml/2006/picture">
                         <pic:nvPicPr>
-                          <pic:cNvPr id="34" name="Picture" descr="Methods_Results_files/figure-docx/fig-prod-marg-1.png"/>
+                          <pic:cNvPr id="33" name="Picture"/>
                           <pic:cNvPicPr>
                             <a:picLocks noChangeAspect="1" noChangeArrowheads="1"/>
                           </pic:cNvPicPr>
                         </pic:nvPicPr>
                         <pic:blipFill>
-                          <a:blip r:embed="rId6"/>
+                          <a:blip r:embed="rId6" cstate="print">
+                            <a:extLst>
+                              <a:ext uri="{28A0092B-C50C-407E-A947-70E740481C1C}">
+                                <a14:useLocalDpi xmlns:a14="http://schemas.microsoft.com/office/drawing/2010/main" val="0"/>
+                              </a:ext>
+                            </a:extLst>
+                          </a:blip>
                           <a:stretch>
                             <a:fillRect/>
                           </a:stretch>
@@ -5423,7 +5453,7 @@
                         <pic:spPr bwMode="auto">
                           <a:xfrm>
                             <a:off x="0" y="0"/>
-                            <a:ext cx="5334000" cy="6223000"/>
+                            <a:ext cx="5334000" cy="5334000"/>
                           </a:xfrm>
                           <a:prstGeom prst="rect">
                             <a:avLst/>
@@ -5448,20 +5478,30 @@
               <w:spacing w:before="200"/>
             </w:pPr>
             <w:r>
-              <w:t xml:space="preserve">Figure 2: Predicted marginal effects of each covariate in the smolts/spawner GAM (other covariates are fixed at mean values). Plots B-F have log-transformed the y-axis to improve visability. (A) shows the effect of spawners on smolts, (B) shows the effect of the mean redd river kilometer, (C) shows the effect of the standard deviation of redd river kilometer, (D) shows the trend associated with emigration year, and (E) shows the effect </w:t>
+              <w:t xml:space="preserve">Figure 2: </w:t>
+            </w:r>
+            <w:r>
+              <w:t xml:space="preserve">Predicted marginal effects of each covariate in the smolts/spawner GAM (other covariates are fixed at mean values). Plots B-F have log-transformed the y-axis to improve </w:t>
+            </w:r>
+            <w:proofErr w:type="spellStart"/>
+            <w:r>
+              <w:t>visability</w:t>
+            </w:r>
+            <w:proofErr w:type="spellEnd"/>
+            <w:r>
+              <w:t xml:space="preserve">. (A) shows the effect of spawners on smolts, (B) shows the effect of the mean redd river kilometer, (C) shows the effect of the standard deviation of redd river kilometer, (D) shows the trend associated with emigration year, and (E) shows the effect of </w:t>
+            </w:r>
+            <w:proofErr w:type="spellStart"/>
+            <w:r>
+              <w:t>pHOS</w:t>
+            </w:r>
+            <w:proofErr w:type="spellEnd"/>
+            <w:r>
+              <w:t xml:space="preserve"> and proportion of out-of-basin stray hatchery fish. Gray ribbons depict 95% confidence intervals, while points depict the partial residuals for that covariate. The vertical dashed line in A represents the estimated value of spawners (845) that lead to </w:t>
             </w:r>
             <w:r>
               <w:lastRenderedPageBreak/>
-              <w:t>of pHOS and proportion of out-of-basin stray hatchery fish. Gray ribbons depict 95% confidence intervals, while points depict the partial residuals for that covariate. The vertical dashed line in A represents the estimated value of spawners (</w:t>
-            </w:r>
-            <w:r>
-              <w:rPr>
-                <w:rStyle w:val="VerbatimChar"/>
-              </w:rPr>
-              <w:t>r smolt_capacity$spawners) that lead to the maximum number of smolts (</w:t>
-            </w:r>
-            <w:r>
-              <w:t>r prettyNum(round(smolt_capacity$smolts), big.mark = ‘,’)`) which is depicted by the horizontal dashed line. The vertical dashed line in B represents the location of the weir.</w:t>
+              <w:t>the maximum number of smolts (41,286) which is depicted by the horizontal dashed line. The vertical dashed line in B represents the location of the weir.</w:t>
             </w:r>
           </w:p>
         </w:tc>
@@ -9267,11 +9307,7 @@
         </w:r>
       </w:hyperlink>
       <w:r>
-        <w:t xml:space="preserve"> A) are 389 total (Age 3+) returns, which occur when there are 397 spawners respectively in the Tucannon River. Mean smolt length appears to have a positive association with SAR, but a negligible one with R/S. On the other hand, pHOS shows a negative association with </w:t>
-      </w:r>
-      <w:r>
-        <w:lastRenderedPageBreak/>
-        <w:t>SAR, and a non-linear but not significant relationship with R/S. The smoothed spline for brood year shows a few periods with higher SAR and R/S compared with other periods in the time-series.</w:t>
+        <w:t xml:space="preserve"> A) are 389 total (Age 3+) returns, which occur when there are 397 spawners respectively in the Tucannon River. Mean smolt length appears to have a positive association with SAR, but a negligible one with R/S. On the other hand, pHOS shows a negative association with SAR, and a non-linear but not significant relationship with R/S. The smoothed spline for brood year shows a few periods with higher SAR and R/S compared with other periods in the time-series.</w:t>
       </w:r>
     </w:p>
     <w:tbl>
@@ -9299,6 +9335,7 @@
               <w:rPr>
                 <w:noProof/>
               </w:rPr>
+              <w:lastRenderedPageBreak/>
               <w:drawing>
                 <wp:inline distT="0" distB="0" distL="0" distR="0" wp14:anchorId="55F92A39" wp14:editId="55F92A3A">
                   <wp:extent cx="5334000" cy="2667000"/>

</xml_diff>

<commit_message>
slight formatting changes, re-rendered to html and docx files
</commit_message>
<xml_diff>
--- a/analysis/paper/Methods_Results.docx
+++ b/analysis/paper/Methods_Results.docx
@@ -31,7 +31,7 @@
         <w:pStyle w:val="Date"/>
       </w:pPr>
       <w:r>
-        <w:t>2026-07-13</w:t>
+        <w:t>2026-09-23</w:t>
       </w:r>
     </w:p>
     <w:p>
@@ -252,13 +252,7 @@
         <w:pStyle w:val="BodyText"/>
       </w:pPr>
       <w:r>
-        <w:t>We also evaluated whether local rearing habitat conditions or infrastructure, inferred from spawning distribution, influenced smolts-per-spawner. The hatchery weir, located at rkm 59, may impact adult passage through delays, etc. (Wilson and Buehrens 2024). Additionally, the habitat in the upper watershed is more pristine while the habitat in the lower watershed is more heavily impacted. Because many potential habitat-related metrics (e.g., proportion of redds above/below the weir, proportion in the upper w</w:t>
-      </w:r>
-      <w:r>
-        <w:t>atershed, proportion in the lower watershed, etc.) are highly correlated, we chose to examine the mean rkm of the redds each year as a singular covariate to summarize the spatial distribution of spawning. We hypothesize that the higher mean redd rkm values, reflecting more spawning in higher quality upstream habitats, would be associated with greater smolts-per-spawner. We also included the standard deviation of the redd rkms, as a measure of how concentrated (small value) or dispersed (high value) the redd</w:t>
-      </w:r>
-      <w:r>
-        <w:t>s were within the watershed in a given year.</w:t>
+        <w:t>We also evaluated whether local rearing habitat conditions or infrastructure, inferred from spawning distribution, influenced smolts-per-spawner. The hatchery weir, located at rkm 59, may impact adult passage through delays, etc. (Wilson and Buehrens 2024). Additionally, the habitat in the upper watershed is more pristine while the habitat in the lower watershed is more heavily impacted. Because many potential habitat-related metrics (e.g., proportion of redds above/below the weir, proportion in the upper watershed, proportion in the lower watershed, etc.) are highly correlated, we chose to examine the mean rkm of the redds each year as a singular covariate to summarize the spatial distribution of spawning. We hypothesize that the higher mean redd rkm values, reflecting more spawning in higher quality upstream habitats, would be associated with greater smolts-per-spawner. We also included the standard deviation of the redd rkms, as a measure of how concentrated (small value) or dispersed (high value) the redds were within the watershed in a given year.</w:t>
       </w:r>
     </w:p>
     <w:p>
@@ -276,17 +270,11 @@
         <w:pStyle w:val="FirstParagraph"/>
       </w:pPr>
       <w:r>
-        <w:t>To examine the effects of selected covariates on smolts-per-spawner, we fit a generalized additive model (GAM), using the log of smolts-per-spawner as the response variable. We included spline terms for mean rkm of redds, standard deviation of rkm per redds, pHOS, and emigration year. The inclusion of emigration year helps to control for long-term trends and effects that are not accounted for by the other covariates. We used a GAM to accommodate potential non-linear relationships between covariates and prod</w:t>
-      </w:r>
-      <w:r>
-        <w:t xml:space="preserve">uctivity. In addition to the spline terms, we included two fixed effects: the number of spawners and an interaction between pHOS and the proportion of out-of-basin strays. Including spawners as a fixed term assumes a linear relationship between the log of smolts-per-spawner and </w:t>
+        <w:t xml:space="preserve">To examine the effects of selected covariates on smolts-per-spawner, we fit a generalized additive model (GAM), using the log of smolts-per-spawner as the response variable. We included spline terms for mean rkm of redds, standard deviation of rkm per redds, pHOS, and emigration year. The inclusion of emigration year helps to control for long-term trends and effects that are not accounted for by the other covariates. We used a GAM to accommodate potential non-linear relationships between covariates and productivity. In addition to the spline terms, we included two fixed effects: the number of spawners and an interaction between pHOS and the proportion of out-of-basin strays. Including spawners as a fixed term assumes a linear relationship between the log of smolts-per-spawner and </w:t>
       </w:r>
       <w:r>
         <w:lastRenderedPageBreak/>
-        <w:t>the total number of spawners, consistent with a linearized Ricker model and the understanding that every ecological system is subject to some carrying capacity constraints (Chapman and Byron 2018). This approach also allowed us to al</w:t>
-      </w:r>
-      <w:r>
-        <w:t>locate more degrees of freedom to the splines of the other covariates.</w:t>
+        <w:t>the total number of spawners, consistent with a linearized Ricker model and the understanding that every ecological system is subject to some carrying capacity constraints (Chapman and Byron 2018). This approach also allowed us to allocate more degrees of freedom to the splines of the other covariates.</w:t>
       </w:r>
     </w:p>
     <w:p>
@@ -294,10 +282,7 @@
         <w:pStyle w:val="BodyText"/>
       </w:pPr>
       <w:r>
-        <w:t>We also examined the effects of mean smolt length and pHOS on productivity by fitting two more GAMs using SAR and R/S as the dependent variables. We included spline terms for mean smolt length in each brood year, pHOS, and brood year. The SAR model was fit using a quasi-binomial GAM with a logit link to account for the proportional nature of the response, while the R/S model was fit using a GAM with a log link. In both models, spawner abundance was included as a fixed linear parametric term, consistent with</w:t>
-      </w:r>
-      <w:r>
-        <w:t xml:space="preserve"> a linearized Ricker model structure.</w:t>
+        <w:t>We also examined the effects of mean smolt length and pHOS on productivity by fitting two more GAMs using SAR and R/S as the dependent variables. We included spline terms for mean smolt length in each brood year, pHOS, and brood year. The SAR model was fit using a quasi-binomial GAM with a logit link to account for the proportional nature of the response, while the R/S model was fit using a GAM with a log link. In both models, spawner abundance was included as a fixed linear parametric term, consistent with a linearized Ricker model structure.</w:t>
       </w:r>
     </w:p>
     <w:p>
@@ -305,10 +290,7 @@
         <w:pStyle w:val="BodyText"/>
       </w:pPr>
       <w:r>
-        <w:t>Our goal with these analyses is to examine general patterns of how a few key covariates influence population productivity, rather than to formally test hypotheses or predict future productivity. The dataset has 35 data points; therefore, we limited the number of knots in all splines to a maximum of four for all covariates except emigration or brood year, which we allowed to be larger as that term was meant to capture any other processes and long-term trends. We fit a spline for year, rather than treating ye</w:t>
-      </w:r>
-      <w:r>
-        <w:t xml:space="preserve">ar as a random effect, because we expected the effects to be auto-correlated and to capture any long-term trend. The models were fit using R statistical software version 4.3.2 (R Core Team 2023) with the mgcv package (Wood 2011), using restricted maximum likelihood methods. We checked the effective degrees of freedom in each model fit using the </w:t>
+        <w:t xml:space="preserve">Our goal with these analyses is to examine general patterns of how a few key covariates influence population productivity, rather than to formally test hypotheses or predict future productivity. The dataset has 35 data points; therefore, we limited the number of knots in all splines to a maximum of four for all covariates except emigration or brood year, which we allowed to be larger as that term was meant to capture any other processes and long-term trends. We fit a spline for year, rather than treating year as a random effect, because we expected the effects to be auto-correlated and to capture any long-term trend. The models were fit using R statistical software version 4.3.2 (R Core Team 2023) with the mgcv package (Wood 2011), using restricted maximum likelihood methods. We checked the effective degrees of freedom in each model fit using the </w:t>
       </w:r>
       <w:r>
         <w:rPr>
@@ -317,12 +299,9 @@
         <w:t>k.check( )</w:t>
       </w:r>
       <w:r>
-        <w:t xml:space="preserve"> function to ensure against underfitting, while the use of penalized splines guarded against overfitting. Data and code to reproduce this analysis is avail</w:t>
+        <w:t xml:space="preserve"> function to ensure against underfitting, while the use of penalized splines guarded against overfitting. Data and code to reproduce this analysis is available on a GitHub repository (</w:t>
       </w:r>
-      <w:r>
-        <w:t>able on a GitHub repository (</w:t>
-      </w:r>
-      <w:hyperlink r:id="rId8">
+      <w:hyperlink r:id="rId5">
         <w:r>
           <w:rPr>
             <w:rStyle w:val="Hyperlink"/>
@@ -725,11 +704,7 @@
         <w:pStyle w:val="BodyText"/>
       </w:pPr>
       <w:r>
-        <w:t xml:space="preserve">Diagnostic checks for all models indicated no evidence of underfitting due to overly restrictive spline specification. The summary statistics for each model, including the </w:t>
-      </w:r>
-      <w:r>
-        <w:lastRenderedPageBreak/>
-        <w:t xml:space="preserve">pseudo-R2 value and the percent of deviance explained by each model are provided in </w:t>
+        <w:t xml:space="preserve">Diagnostic checks for all models indicated no evidence of underfitting due to overly restrictive spline specification. The summary statistics for each model, including the pseudo-R2 value and the percent of deviance explained by each model are provided in </w:t>
       </w:r>
       <w:hyperlink w:anchor="tbl-r2">
         <w:r>
@@ -793,7 +768,7 @@
       <w:r>
         <w:t xml:space="preserve">Chapman, E. J., and C. J. Byron. 2018. </w:t>
       </w:r>
-      <w:hyperlink r:id="rId9">
+      <w:hyperlink r:id="rId6">
         <w:r>
           <w:rPr>
             <w:rStyle w:val="Hyperlink"/>
@@ -824,7 +799,7 @@
       <w:r>
         <w:t xml:space="preserve">Wilson, J. T., and T. W. Buehrens. 2024. </w:t>
       </w:r>
-      <w:hyperlink r:id="rId10">
+      <w:hyperlink r:id="rId7">
         <w:r>
           <w:rPr>
             <w:rStyle w:val="Hyperlink"/>
@@ -845,7 +820,7 @@
       <w:r>
         <w:t xml:space="preserve">Wood, S. N. 2011. </w:t>
       </w:r>
-      <w:hyperlink r:id="rId11">
+      <w:hyperlink r:id="rId8">
         <w:r>
           <w:rPr>
             <w:rStyle w:val="Hyperlink"/>
@@ -901,22 +876,22 @@
                 <w:noProof/>
               </w:rPr>
               <w:drawing>
-                <wp:inline distT="0" distB="0" distL="0" distR="0" wp14:anchorId="4E624A82" wp14:editId="2BD13B57">
+                <wp:inline distT="0" distB="0" distL="0" distR="0" wp14:anchorId="1B6042C8" wp14:editId="56EEBE42">
                   <wp:extent cx="5334000" cy="4119404"/>
                   <wp:effectExtent l="0" t="0" r="0" b="0"/>
-                  <wp:docPr id="41" name="Picture"/>
+                  <wp:docPr id="30" name="Picture"/>
                   <wp:cNvGraphicFramePr/>
                   <a:graphic xmlns:a="http://schemas.openxmlformats.org/drawingml/2006/main">
                     <a:graphicData uri="http://schemas.openxmlformats.org/drawingml/2006/picture">
                       <pic:pic xmlns:pic="http://schemas.openxmlformats.org/drawingml/2006/picture">
                         <pic:nvPicPr>
-                          <pic:cNvPr id="42" name="Picture" descr="../figures/map_tucannon.png"/>
+                          <pic:cNvPr id="31" name="Picture" descr="../figures/map_tucannon.png"/>
                           <pic:cNvPicPr>
                             <a:picLocks noChangeAspect="1" noChangeArrowheads="1"/>
                           </pic:cNvPicPr>
                         </pic:nvPicPr>
                         <pic:blipFill>
-                          <a:blip r:embed="rId12"/>
+                          <a:blip r:embed="rId9"/>
                           <a:stretch>
                             <a:fillRect/>
                           </a:stretch>
@@ -971,22 +946,22 @@
                 <w:noProof/>
               </w:rPr>
               <w:drawing>
-                <wp:inline distT="0" distB="0" distL="0" distR="0" wp14:anchorId="14DE317B" wp14:editId="2B1CE9FE">
+                <wp:inline distT="0" distB="0" distL="0" distR="0" wp14:anchorId="2005CE62" wp14:editId="19CB485E">
                   <wp:extent cx="5334000" cy="2956161"/>
                   <wp:effectExtent l="0" t="0" r="0" b="0"/>
-                  <wp:docPr id="45" name="Picture"/>
+                  <wp:docPr id="34" name="Picture"/>
                   <wp:cNvGraphicFramePr/>
                   <a:graphic xmlns:a="http://schemas.openxmlformats.org/drawingml/2006/main">
                     <a:graphicData uri="http://schemas.openxmlformats.org/drawingml/2006/picture">
                       <pic:pic xmlns:pic="http://schemas.openxmlformats.org/drawingml/2006/picture">
                         <pic:nvPicPr>
-                          <pic:cNvPr id="46" name="Picture" descr="../figures/escp_barchart.png"/>
+                          <pic:cNvPr id="35" name="Picture" descr="../figures/escp_barchart.png"/>
                           <pic:cNvPicPr>
                             <a:picLocks noChangeAspect="1" noChangeArrowheads="1"/>
                           </pic:cNvPicPr>
                         </pic:nvPicPr>
                         <pic:blipFill>
-                          <a:blip r:embed="rId13"/>
+                          <a:blip r:embed="rId10"/>
                           <a:stretch>
                             <a:fillRect/>
                           </a:stretch>
@@ -1043,22 +1018,22 @@
               </w:rPr>
               <w:lastRenderedPageBreak/>
               <w:drawing>
-                <wp:inline distT="0" distB="0" distL="0" distR="0" wp14:anchorId="0F49727E" wp14:editId="0FBA0E9D">
+                <wp:inline distT="0" distB="0" distL="0" distR="0" wp14:anchorId="26A3EB8F" wp14:editId="79908345">
                   <wp:extent cx="5334000" cy="7112000"/>
                   <wp:effectExtent l="0" t="0" r="0" b="0"/>
-                  <wp:docPr id="49" name="Picture"/>
+                  <wp:docPr id="38" name="Picture"/>
                   <wp:cNvGraphicFramePr/>
                   <a:graphic xmlns:a="http://schemas.openxmlformats.org/drawingml/2006/main">
                     <a:graphicData uri="http://schemas.openxmlformats.org/drawingml/2006/picture">
                       <pic:pic xmlns:pic="http://schemas.openxmlformats.org/drawingml/2006/picture">
                         <pic:nvPicPr>
-                          <pic:cNvPr id="50" name="Picture" descr="Methods_Results_files/figure-docx/fig-prelim-ts-1.png"/>
+                          <pic:cNvPr id="39" name="Picture" descr="Methods_Results_files/figure-docx/fig-prelim-ts-1.png"/>
                           <pic:cNvPicPr>
                             <a:picLocks noChangeAspect="1" noChangeArrowheads="1"/>
                           </pic:cNvPicPr>
                         </pic:nvPicPr>
                         <pic:blipFill>
-                          <a:blip r:embed="rId14"/>
+                          <a:blip r:embed="rId11"/>
                           <a:stretch>
                             <a:fillRect/>
                           </a:stretch>
@@ -1091,8 +1066,11 @@
               <w:spacing w:before="200"/>
             </w:pPr>
             <w:r>
+              <w:t xml:space="preserve">Figure 3: Time series plots of Tucannon River Spring Chinook Salmon data showing </w:t>
+            </w:r>
+            <w:r>
               <w:lastRenderedPageBreak/>
-              <w:t>Figure 3: Time series plots of Tucannon River Spring Chinook Salmon data showing spawners (A), smolts (B), smolts/spawner (C), pHOS (D), and the proportion of out-of-basin strays (E) in the Tucannon watershed through time</w:t>
+              <w:t>spawners (A), smolts (B), smolts/spawner (C), pHOS (D), and the proportion of out-of-basin strays (E) in the Tucannon watershed through time</w:t>
             </w:r>
           </w:p>
         </w:tc>
@@ -1115,22 +1093,22 @@
               </w:rPr>
               <w:lastRenderedPageBreak/>
               <w:drawing>
-                <wp:inline distT="0" distB="0" distL="0" distR="0" wp14:anchorId="6FCF5168" wp14:editId="7F7301B5">
+                <wp:inline distT="0" distB="0" distL="0" distR="0" wp14:anchorId="3808E25B" wp14:editId="47E0934D">
                   <wp:extent cx="5334000" cy="6223000"/>
                   <wp:effectExtent l="0" t="0" r="0" b="0"/>
-                  <wp:docPr id="53" name="Picture"/>
+                  <wp:docPr id="42" name="Picture"/>
                   <wp:cNvGraphicFramePr/>
                   <a:graphic xmlns:a="http://schemas.openxmlformats.org/drawingml/2006/main">
                     <a:graphicData uri="http://schemas.openxmlformats.org/drawingml/2006/picture">
                       <pic:pic xmlns:pic="http://schemas.openxmlformats.org/drawingml/2006/picture">
                         <pic:nvPicPr>
-                          <pic:cNvPr id="54" name="Picture" descr="Methods_Results_files/figure-docx/fig-prod-marg-1.png"/>
+                          <pic:cNvPr id="43" name="Picture" descr="Methods_Results_files/figure-docx/fig-prod-marg-1.png"/>
                           <pic:cNvPicPr>
                             <a:picLocks noChangeAspect="1" noChangeArrowheads="1"/>
                           </pic:cNvPicPr>
                         </pic:nvPicPr>
                         <pic:blipFill>
-                          <a:blip r:embed="rId15"/>
+                          <a:blip r:embed="rId12"/>
                           <a:stretch>
                             <a:fillRect/>
                           </a:stretch>
@@ -1163,14 +1141,11 @@
               <w:spacing w:before="200"/>
             </w:pPr>
             <w:r>
-              <w:t>Figure 4: Predicted marginal effects of each covariate in the smolts/spawner GAM (other covariates are fixed at mean values). Plots B-F have log-transformed the y-axis to improve visability. (A) shows the effect of spawners on smolts, (B) shows the effect of the mean redd river kilometer, (C) shows the effect of the standard deviation of redd river kilometer, (D) shows the trend associated with emigration year, and (E) shows the effect of pHOS and proportion of out-of-basin stray hatchery fish. Gray ribbons</w:t>
-            </w:r>
-            <w:r>
-              <w:t xml:space="preserve"> depict 95% confidence </w:t>
+              <w:t xml:space="preserve">Figure 4: Predicted marginal effects of each covariate in the smolts/spawner GAM (other covariates are fixed at mean values). Plots B-F have log-transformed the y-axis to improve visability. (A) shows the effect of spawners on smolts, (B) shows the effect of the mean redd river kilometer, (C) shows the effect of the standard deviation of redd river kilometer, (D) shows the trend associated with emigration year, and (E) shows the effect of pHOS and proportion of out-of-basin stray hatchery fish. Gray ribbons depict 95% confidence intervals, while points depict the partial residuals for that covariate. The vertical dashed </w:t>
             </w:r>
             <w:r>
               <w:lastRenderedPageBreak/>
-              <w:t>intervals, while points depict the partial residuals for that covariate. The vertical dashed line in A represents the estimated value of spawners (845) that lead to the maximum number of smolts (41,286) which is depicted by the horizontal dashed line. The vertical dashed line in B represents the location of the weir.</w:t>
+              <w:t>line in A represents the estimated value of spawners (845) that lead to the maximum number of smolts (41,286) which is depicted by the horizontal dashed line. The vertical dashed line in B represents the location of the weir.</w:t>
             </w:r>
           </w:p>
         </w:tc>
@@ -1193,22 +1168,22 @@
               </w:rPr>
               <w:lastRenderedPageBreak/>
               <w:drawing>
-                <wp:inline distT="0" distB="0" distL="0" distR="0" wp14:anchorId="7A157190" wp14:editId="23B2A869">
+                <wp:inline distT="0" distB="0" distL="0" distR="0" wp14:anchorId="0D7FCD70" wp14:editId="7AF8FAB4">
                   <wp:extent cx="3696101" cy="3696101"/>
                   <wp:effectExtent l="0" t="0" r="0" b="0"/>
-                  <wp:docPr id="57" name="Picture"/>
+                  <wp:docPr id="46" name="Picture"/>
                   <wp:cNvGraphicFramePr/>
                   <a:graphic xmlns:a="http://schemas.openxmlformats.org/drawingml/2006/main">
                     <a:graphicData uri="http://schemas.openxmlformats.org/drawingml/2006/picture">
                       <pic:pic xmlns:pic="http://schemas.openxmlformats.org/drawingml/2006/picture">
                         <pic:nvPicPr>
-                          <pic:cNvPr id="58" name="Picture" descr="Methods_Results_files/figure-docx/fig-rec-marg-spwn-1.png"/>
+                          <pic:cNvPr id="47" name="Picture" descr="Methods_Results_files/figure-docx/fig-rec-marg-spwn-1.png"/>
                           <pic:cNvPicPr>
                             <a:picLocks noChangeAspect="1" noChangeArrowheads="1"/>
                           </pic:cNvPicPr>
                         </pic:nvPicPr>
                         <pic:blipFill>
-                          <a:blip r:embed="rId16"/>
+                          <a:blip r:embed="rId13"/>
                           <a:stretch>
                             <a:fillRect/>
                           </a:stretch>
@@ -1264,22 +1239,22 @@
               </w:rPr>
               <w:lastRenderedPageBreak/>
               <w:drawing>
-                <wp:inline distT="0" distB="0" distL="0" distR="0" wp14:anchorId="17F38ACE" wp14:editId="7520BF53">
+                <wp:inline distT="0" distB="0" distL="0" distR="0" wp14:anchorId="3CB6D45C" wp14:editId="4CFDA8C2">
                   <wp:extent cx="5334000" cy="6223000"/>
                   <wp:effectExtent l="0" t="0" r="0" b="0"/>
-                  <wp:docPr id="61" name="Picture"/>
+                  <wp:docPr id="50" name="Picture"/>
                   <wp:cNvGraphicFramePr/>
                   <a:graphic xmlns:a="http://schemas.openxmlformats.org/drawingml/2006/main">
                     <a:graphicData uri="http://schemas.openxmlformats.org/drawingml/2006/picture">
                       <pic:pic xmlns:pic="http://schemas.openxmlformats.org/drawingml/2006/picture">
                         <pic:nvPicPr>
-                          <pic:cNvPr id="62" name="Picture" descr="Methods_Results_files/figure-docx/fig-rec-marg-all-1.png"/>
+                          <pic:cNvPr id="51" name="Picture" descr="Methods_Results_files/figure-docx/fig-rec-marg-all-1.png"/>
                           <pic:cNvPicPr>
                             <a:picLocks noChangeAspect="1" noChangeArrowheads="1"/>
                           </pic:cNvPicPr>
                         </pic:nvPicPr>
                         <pic:blipFill>
-                          <a:blip r:embed="rId17"/>
+                          <a:blip r:embed="rId14"/>
                           <a:stretch>
                             <a:fillRect/>
                           </a:stretch>
@@ -1348,7 +1323,7 @@
       <w:tr>
         <w:tc>
           <w:tcPr>
-            <w:tcW w:w="9576" w:type="dxa"/>
+            <w:tcW w:w="7920" w:type="dxa"/>
           </w:tcPr>
           <w:p>
             <w:pPr>
@@ -2603,7 +2578,7 @@
       <w:tr>
         <w:tc>
           <w:tcPr>
-            <w:tcW w:w="9576" w:type="dxa"/>
+            <w:tcW w:w="7920" w:type="dxa"/>
           </w:tcPr>
           <w:p>
             <w:pPr>
@@ -2618,19 +2593,19 @@
           <w:tbl>
             <w:tblPr>
               <w:tblStyle w:val="Table"/>
-              <w:tblW w:w="9666" w:type="dxa"/>
+              <w:tblW w:w="0" w:type="auto"/>
               <w:jc w:val="center"/>
               <w:tblLayout w:type="fixed"/>
               <w:tblLook w:val="0420" w:firstRow="1" w:lastRow="0" w:firstColumn="0" w:lastColumn="0" w:noHBand="0" w:noVBand="1"/>
             </w:tblPr>
             <w:tblGrid>
-              <w:gridCol w:w="2301"/>
+              <w:gridCol w:w="1478"/>
               <w:gridCol w:w="1244"/>
               <w:gridCol w:w="911"/>
               <w:gridCol w:w="1189"/>
               <w:gridCol w:w="1122"/>
               <w:gridCol w:w="1500"/>
-              <w:gridCol w:w="1399"/>
+              <w:gridCol w:w="1500"/>
             </w:tblGrid>
             <w:tr>
               <w:trPr>
@@ -2640,7 +2615,7 @@
               </w:trPr>
               <w:tc>
                 <w:tcPr>
-                  <w:tcW w:w="2301" w:type="dxa"/>
+                  <w:tcW w:w="1478" w:type="dxa"/>
                   <w:tcBorders>
                     <w:top w:val="single" w:sz="8" w:space="0" w:color="666666"/>
                     <w:left w:val="none" w:sz="0" w:space="0" w:color="FFFFFF"/>
@@ -2939,7 +2914,7 @@
               </w:tc>
               <w:tc>
                 <w:tcPr>
-                  <w:tcW w:w="1399" w:type="dxa"/>
+                  <w:tcW w:w="1500" w:type="dxa"/>
                   <w:tcBorders>
                     <w:top w:val="single" w:sz="8" w:space="0" w:color="666666"/>
                     <w:left w:val="none" w:sz="0" w:space="0" w:color="FFFFFF"/>
@@ -3003,7 +2978,7 @@
               </w:trPr>
               <w:tc>
                 <w:tcPr>
-                  <w:tcW w:w="2301" w:type="dxa"/>
+                  <w:tcW w:w="1478" w:type="dxa"/>
                   <w:tcBorders>
                     <w:top w:val="single" w:sz="8" w:space="0" w:color="666666"/>
                     <w:left w:val="none" w:sz="0" w:space="0" w:color="FFFFFF"/>
@@ -3279,7 +3254,7 @@
               </w:tc>
               <w:tc>
                 <w:tcPr>
-                  <w:tcW w:w="1399" w:type="dxa"/>
+                  <w:tcW w:w="1500" w:type="dxa"/>
                   <w:tcBorders>
                     <w:top w:val="single" w:sz="8" w:space="0" w:color="666666"/>
                     <w:left w:val="none" w:sz="0" w:space="0" w:color="FFFFFF"/>
@@ -3330,7 +3305,7 @@
               </w:trPr>
               <w:tc>
                 <w:tcPr>
-                  <w:tcW w:w="2301" w:type="dxa"/>
+                  <w:tcW w:w="1478" w:type="dxa"/>
                   <w:tcBorders>
                     <w:top w:val="none" w:sz="0" w:space="0" w:color="FFFFFF"/>
                     <w:left w:val="none" w:sz="0" w:space="0" w:color="FFFFFF"/>
@@ -3606,7 +3581,7 @@
               </w:tc>
               <w:tc>
                 <w:tcPr>
-                  <w:tcW w:w="1399" w:type="dxa"/>
+                  <w:tcW w:w="1500" w:type="dxa"/>
                   <w:tcBorders>
                     <w:top w:val="none" w:sz="0" w:space="0" w:color="FFFFFF"/>
                     <w:left w:val="none" w:sz="0" w:space="0" w:color="FFFFFF"/>
@@ -3657,7 +3632,7 @@
               </w:trPr>
               <w:tc>
                 <w:tcPr>
-                  <w:tcW w:w="2301" w:type="dxa"/>
+                  <w:tcW w:w="1478" w:type="dxa"/>
                   <w:tcBorders>
                     <w:top w:val="none" w:sz="0" w:space="0" w:color="FFFFFF"/>
                     <w:left w:val="none" w:sz="0" w:space="0" w:color="FFFFFF"/>
@@ -3697,7 +3672,17 @@
                       <w:sz w:val="20"/>
                       <w:szCs w:val="20"/>
                     </w:rPr>
-                    <w:t>pHOS:Stray Proportion</w:t>
+                    <w:t>pHOS:Stray</w:t>
+                  </w:r>
+                  <w:r>
+                    <w:rPr>
+                      <w:rFonts w:ascii="Arial" w:eastAsia="Arial" w:hAnsi="Arial" w:cs="Arial"/>
+                      <w:color w:val="000000"/>
+                      <w:sz w:val="20"/>
+                      <w:szCs w:val="20"/>
+                    </w:rPr>
+                    <w:br/>
+                    <w:t>Proportion</w:t>
                   </w:r>
                 </w:p>
               </w:tc>
@@ -3933,7 +3918,7 @@
               </w:tc>
               <w:tc>
                 <w:tcPr>
-                  <w:tcW w:w="1399" w:type="dxa"/>
+                  <w:tcW w:w="1500" w:type="dxa"/>
                   <w:tcBorders>
                     <w:top w:val="none" w:sz="0" w:space="0" w:color="FFFFFF"/>
                     <w:left w:val="none" w:sz="0" w:space="0" w:color="FFFFFF"/>
@@ -3990,7 +3975,7 @@
       <w:tr>
         <w:tc>
           <w:tcPr>
-            <w:tcW w:w="9576" w:type="dxa"/>
+            <w:tcW w:w="7920" w:type="dxa"/>
           </w:tcPr>
           <w:p>
             <w:pPr>
@@ -5216,7 +5201,7 @@
       <w:tr>
         <w:tc>
           <w:tcPr>
-            <w:tcW w:w="9576" w:type="dxa"/>
+            <w:tcW w:w="7920" w:type="dxa"/>
           </w:tcPr>
           <w:p>
             <w:pPr>
@@ -6275,11 +6260,7 @@
       </w:tr>
     </w:tbl>
     <w:p>
-      <w:bookmarkStart w:id="28" w:name="tbl-edf-coef"/>
       <w:r>
-        <w:rPr>
-          <w:i/>
-        </w:rPr>
         <w:br w:type="page"/>
       </w:r>
     </w:p>
@@ -6303,6 +6284,7 @@
               <w:pStyle w:val="ImageCaption"/>
               <w:spacing w:before="200"/>
             </w:pPr>
+            <w:bookmarkStart w:id="28" w:name="tbl-edf-coef"/>
             <w:r>
               <w:lastRenderedPageBreak/>
               <w:t>Table 5: Effective degrees of freedom and statistical significance tests for the total SAR and returns/spawner GAMs. (* denotes significant, ** denotes highly significant, and N.S. denotes not significant)</w:t>
@@ -6311,14 +6293,13 @@
           <w:tbl>
             <w:tblPr>
               <w:tblStyle w:val="Table"/>
-              <w:tblW w:w="9629" w:type="dxa"/>
+              <w:tblW w:w="0" w:type="auto"/>
               <w:jc w:val="center"/>
               <w:tblLayout w:type="fixed"/>
               <w:tblLook w:val="0420" w:firstRow="1" w:lastRow="0" w:firstColumn="0" w:lastColumn="0" w:noHBand="0" w:noVBand="1"/>
             </w:tblPr>
             <w:tblGrid>
-              <w:gridCol w:w="1193"/>
-              <w:gridCol w:w="1003"/>
+              <w:gridCol w:w="2067"/>
               <w:gridCol w:w="2278"/>
               <w:gridCol w:w="1022"/>
               <w:gridCol w:w="1022"/>
@@ -6334,7 +6315,7 @@
               </w:trPr>
               <w:tc>
                 <w:tcPr>
-                  <w:tcW w:w="1193" w:type="dxa"/>
+                  <w:tcW w:w="2067" w:type="dxa"/>
                   <w:tcBorders>
                     <w:top w:val="single" w:sz="8" w:space="0" w:color="666666"/>
                     <w:left w:val="none" w:sz="0" w:space="0" w:color="FFFFFF"/>
@@ -6377,54 +6358,6 @@
                       <w:szCs w:val="20"/>
                     </w:rPr>
                     <w:t>Model</w:t>
-                  </w:r>
-                </w:p>
-              </w:tc>
-              <w:tc>
-                <w:tcPr>
-                  <w:tcW w:w="1003" w:type="dxa"/>
-                  <w:tcBorders>
-                    <w:top w:val="single" w:sz="8" w:space="0" w:color="666666"/>
-                    <w:left w:val="none" w:sz="0" w:space="0" w:color="FFFFFF"/>
-                    <w:bottom w:val="single" w:sz="8" w:space="0" w:color="666666"/>
-                    <w:right w:val="none" w:sz="0" w:space="0" w:color="FFFFFF"/>
-                  </w:tcBorders>
-                  <w:shd w:val="clear" w:color="auto" w:fill="FFFFFF"/>
-                  <w:tcMar>
-                    <w:top w:w="0" w:type="dxa"/>
-                    <w:left w:w="0" w:type="dxa"/>
-                    <w:bottom w:w="0" w:type="dxa"/>
-                    <w:right w:w="0" w:type="dxa"/>
-                  </w:tcMar>
-                  <w:vAlign w:val="center"/>
-                </w:tcPr>
-                <w:p>
-                  <w:pPr>
-                    <w:pBdr>
-                      <w:top w:val="none" w:sz="0" w:space="0" w:color="000000"/>
-                      <w:left w:val="none" w:sz="0" w:space="0" w:color="000000"/>
-                      <w:bottom w:val="none" w:sz="0" w:space="0" w:color="000000"/>
-                      <w:right w:val="none" w:sz="0" w:space="0" w:color="000000"/>
-                    </w:pBdr>
-                    <w:spacing w:before="100" w:after="100"/>
-                    <w:ind w:left="100" w:right="100"/>
-                    <w:rPr>
-                      <w:rFonts w:ascii="Arial" w:eastAsia="Arial" w:hAnsi="Arial" w:cs="Arial"/>
-                      <w:b/>
-                      <w:color w:val="000000"/>
-                      <w:sz w:val="20"/>
-                      <w:szCs w:val="20"/>
-                    </w:rPr>
-                  </w:pPr>
-                  <w:r>
-                    <w:rPr>
-                      <w:rFonts w:ascii="Arial" w:eastAsia="Arial" w:hAnsi="Arial" w:cs="Arial"/>
-                      <w:b/>
-                      <w:color w:val="000000"/>
-                      <w:sz w:val="20"/>
-                      <w:szCs w:val="20"/>
-                    </w:rPr>
-                    <w:t>Returns</w:t>
                   </w:r>
                 </w:p>
               </w:tc>
@@ -6723,7 +6656,7 @@
               </w:trPr>
               <w:tc>
                 <w:tcPr>
-                  <w:tcW w:w="1193" w:type="dxa"/>
+                  <w:tcW w:w="2067" w:type="dxa"/>
                   <w:tcBorders>
                     <w:top w:val="single" w:sz="8" w:space="0" w:color="666666"/>
                     <w:left w:val="none" w:sz="0" w:space="0" w:color="FFFFFF"/>
@@ -6764,52 +6697,6 @@
                       <w:szCs w:val="20"/>
                     </w:rPr>
                     <w:t>SAR</w:t>
-                  </w:r>
-                </w:p>
-              </w:tc>
-              <w:tc>
-                <w:tcPr>
-                  <w:tcW w:w="1003" w:type="dxa"/>
-                  <w:tcBorders>
-                    <w:top w:val="single" w:sz="8" w:space="0" w:color="666666"/>
-                    <w:left w:val="none" w:sz="0" w:space="0" w:color="FFFFFF"/>
-                    <w:bottom w:val="none" w:sz="0" w:space="0" w:color="FFFFFF"/>
-                    <w:right w:val="none" w:sz="0" w:space="0" w:color="FFFFFF"/>
-                  </w:tcBorders>
-                  <w:shd w:val="clear" w:color="auto" w:fill="FFFFFF"/>
-                  <w:tcMar>
-                    <w:top w:w="0" w:type="dxa"/>
-                    <w:left w:w="0" w:type="dxa"/>
-                    <w:bottom w:w="0" w:type="dxa"/>
-                    <w:right w:w="0" w:type="dxa"/>
-                  </w:tcMar>
-                  <w:vAlign w:val="center"/>
-                </w:tcPr>
-                <w:p>
-                  <w:pPr>
-                    <w:pBdr>
-                      <w:top w:val="none" w:sz="0" w:space="0" w:color="000000"/>
-                      <w:left w:val="none" w:sz="0" w:space="0" w:color="000000"/>
-                      <w:bottom w:val="none" w:sz="0" w:space="0" w:color="000000"/>
-                      <w:right w:val="none" w:sz="0" w:space="0" w:color="000000"/>
-                    </w:pBdr>
-                    <w:spacing w:before="20" w:after="20"/>
-                    <w:ind w:left="100" w:right="100"/>
-                    <w:rPr>
-                      <w:rFonts w:ascii="Arial" w:eastAsia="Arial" w:hAnsi="Arial" w:cs="Arial"/>
-                      <w:color w:val="000000"/>
-                      <w:sz w:val="20"/>
-                      <w:szCs w:val="20"/>
-                    </w:rPr>
-                  </w:pPr>
-                  <w:r>
-                    <w:rPr>
-                      <w:rFonts w:ascii="Arial" w:eastAsia="Arial" w:hAnsi="Arial" w:cs="Arial"/>
-                      <w:color w:val="000000"/>
-                      <w:sz w:val="20"/>
-                      <w:szCs w:val="20"/>
-                    </w:rPr>
-                    <w:t>Total</w:t>
                   </w:r>
                 </w:p>
               </w:tc>
@@ -7096,7 +6983,7 @@
               </w:trPr>
               <w:tc>
                 <w:tcPr>
-                  <w:tcW w:w="1193" w:type="dxa"/>
+                  <w:tcW w:w="2067" w:type="dxa"/>
                   <w:tcBorders>
                     <w:top w:val="none" w:sz="0" w:space="0" w:color="FFFFFF"/>
                     <w:left w:val="none" w:sz="0" w:space="0" w:color="FFFFFF"/>
@@ -7137,52 +7024,6 @@
                       <w:szCs w:val="20"/>
                     </w:rPr>
                     <w:t>SAR</w:t>
-                  </w:r>
-                </w:p>
-              </w:tc>
-              <w:tc>
-                <w:tcPr>
-                  <w:tcW w:w="1003" w:type="dxa"/>
-                  <w:tcBorders>
-                    <w:top w:val="none" w:sz="0" w:space="0" w:color="FFFFFF"/>
-                    <w:left w:val="none" w:sz="0" w:space="0" w:color="FFFFFF"/>
-                    <w:bottom w:val="none" w:sz="0" w:space="0" w:color="FFFFFF"/>
-                    <w:right w:val="none" w:sz="0" w:space="0" w:color="FFFFFF"/>
-                  </w:tcBorders>
-                  <w:shd w:val="clear" w:color="auto" w:fill="FFFFFF"/>
-                  <w:tcMar>
-                    <w:top w:w="0" w:type="dxa"/>
-                    <w:left w:w="0" w:type="dxa"/>
-                    <w:bottom w:w="0" w:type="dxa"/>
-                    <w:right w:w="0" w:type="dxa"/>
-                  </w:tcMar>
-                  <w:vAlign w:val="center"/>
-                </w:tcPr>
-                <w:p>
-                  <w:pPr>
-                    <w:pBdr>
-                      <w:top w:val="none" w:sz="0" w:space="0" w:color="000000"/>
-                      <w:left w:val="none" w:sz="0" w:space="0" w:color="000000"/>
-                      <w:bottom w:val="none" w:sz="0" w:space="0" w:color="000000"/>
-                      <w:right w:val="none" w:sz="0" w:space="0" w:color="000000"/>
-                    </w:pBdr>
-                    <w:spacing w:before="20" w:after="20"/>
-                    <w:ind w:left="100" w:right="100"/>
-                    <w:rPr>
-                      <w:rFonts w:ascii="Arial" w:eastAsia="Arial" w:hAnsi="Arial" w:cs="Arial"/>
-                      <w:color w:val="000000"/>
-                      <w:sz w:val="20"/>
-                      <w:szCs w:val="20"/>
-                    </w:rPr>
-                  </w:pPr>
-                  <w:r>
-                    <w:rPr>
-                      <w:rFonts w:ascii="Arial" w:eastAsia="Arial" w:hAnsi="Arial" w:cs="Arial"/>
-                      <w:color w:val="000000"/>
-                      <w:sz w:val="20"/>
-                      <w:szCs w:val="20"/>
-                    </w:rPr>
-                    <w:t>Total</w:t>
                   </w:r>
                 </w:p>
               </w:tc>
@@ -7469,7 +7310,7 @@
               </w:trPr>
               <w:tc>
                 <w:tcPr>
-                  <w:tcW w:w="1193" w:type="dxa"/>
+                  <w:tcW w:w="2067" w:type="dxa"/>
                   <w:tcBorders>
                     <w:top w:val="none" w:sz="0" w:space="0" w:color="FFFFFF"/>
                     <w:left w:val="none" w:sz="0" w:space="0" w:color="FFFFFF"/>
@@ -7510,52 +7351,6 @@
                       <w:szCs w:val="20"/>
                     </w:rPr>
                     <w:t>SAR</w:t>
-                  </w:r>
-                </w:p>
-              </w:tc>
-              <w:tc>
-                <w:tcPr>
-                  <w:tcW w:w="1003" w:type="dxa"/>
-                  <w:tcBorders>
-                    <w:top w:val="none" w:sz="0" w:space="0" w:color="FFFFFF"/>
-                    <w:left w:val="none" w:sz="0" w:space="0" w:color="FFFFFF"/>
-                    <w:bottom w:val="none" w:sz="0" w:space="0" w:color="FFFFFF"/>
-                    <w:right w:val="none" w:sz="0" w:space="0" w:color="FFFFFF"/>
-                  </w:tcBorders>
-                  <w:shd w:val="clear" w:color="auto" w:fill="FFFFFF"/>
-                  <w:tcMar>
-                    <w:top w:w="0" w:type="dxa"/>
-                    <w:left w:w="0" w:type="dxa"/>
-                    <w:bottom w:w="0" w:type="dxa"/>
-                    <w:right w:w="0" w:type="dxa"/>
-                  </w:tcMar>
-                  <w:vAlign w:val="center"/>
-                </w:tcPr>
-                <w:p>
-                  <w:pPr>
-                    <w:pBdr>
-                      <w:top w:val="none" w:sz="0" w:space="0" w:color="000000"/>
-                      <w:left w:val="none" w:sz="0" w:space="0" w:color="000000"/>
-                      <w:bottom w:val="none" w:sz="0" w:space="0" w:color="000000"/>
-                      <w:right w:val="none" w:sz="0" w:space="0" w:color="000000"/>
-                    </w:pBdr>
-                    <w:spacing w:before="20" w:after="20"/>
-                    <w:ind w:left="100" w:right="100"/>
-                    <w:rPr>
-                      <w:rFonts w:ascii="Arial" w:eastAsia="Arial" w:hAnsi="Arial" w:cs="Arial"/>
-                      <w:color w:val="000000"/>
-                      <w:sz w:val="20"/>
-                      <w:szCs w:val="20"/>
-                    </w:rPr>
-                  </w:pPr>
-                  <w:r>
-                    <w:rPr>
-                      <w:rFonts w:ascii="Arial" w:eastAsia="Arial" w:hAnsi="Arial" w:cs="Arial"/>
-                      <w:color w:val="000000"/>
-                      <w:sz w:val="20"/>
-                      <w:szCs w:val="20"/>
-                    </w:rPr>
-                    <w:t>Total</w:t>
                   </w:r>
                 </w:p>
               </w:tc>
@@ -7842,7 +7637,7 @@
               </w:trPr>
               <w:tc>
                 <w:tcPr>
-                  <w:tcW w:w="1193" w:type="dxa"/>
+                  <w:tcW w:w="2067" w:type="dxa"/>
                   <w:tcBorders>
                     <w:top w:val="none" w:sz="0" w:space="0" w:color="FFFFFF"/>
                     <w:left w:val="none" w:sz="0" w:space="0" w:color="FFFFFF"/>
@@ -7883,52 +7678,6 @@
                       <w:szCs w:val="20"/>
                     </w:rPr>
                     <w:t>Returns / Spawner</w:t>
-                  </w:r>
-                </w:p>
-              </w:tc>
-              <w:tc>
-                <w:tcPr>
-                  <w:tcW w:w="1003" w:type="dxa"/>
-                  <w:tcBorders>
-                    <w:top w:val="none" w:sz="0" w:space="0" w:color="FFFFFF"/>
-                    <w:left w:val="none" w:sz="0" w:space="0" w:color="FFFFFF"/>
-                    <w:bottom w:val="none" w:sz="0" w:space="0" w:color="FFFFFF"/>
-                    <w:right w:val="none" w:sz="0" w:space="0" w:color="FFFFFF"/>
-                  </w:tcBorders>
-                  <w:shd w:val="clear" w:color="auto" w:fill="FFFFFF"/>
-                  <w:tcMar>
-                    <w:top w:w="0" w:type="dxa"/>
-                    <w:left w:w="0" w:type="dxa"/>
-                    <w:bottom w:w="0" w:type="dxa"/>
-                    <w:right w:w="0" w:type="dxa"/>
-                  </w:tcMar>
-                  <w:vAlign w:val="center"/>
-                </w:tcPr>
-                <w:p>
-                  <w:pPr>
-                    <w:pBdr>
-                      <w:top w:val="none" w:sz="0" w:space="0" w:color="000000"/>
-                      <w:left w:val="none" w:sz="0" w:space="0" w:color="000000"/>
-                      <w:bottom w:val="none" w:sz="0" w:space="0" w:color="000000"/>
-                      <w:right w:val="none" w:sz="0" w:space="0" w:color="000000"/>
-                    </w:pBdr>
-                    <w:spacing w:before="20" w:after="20"/>
-                    <w:ind w:left="100" w:right="100"/>
-                    <w:rPr>
-                      <w:rFonts w:ascii="Arial" w:eastAsia="Arial" w:hAnsi="Arial" w:cs="Arial"/>
-                      <w:color w:val="000000"/>
-                      <w:sz w:val="20"/>
-                      <w:szCs w:val="20"/>
-                    </w:rPr>
-                  </w:pPr>
-                  <w:r>
-                    <w:rPr>
-                      <w:rFonts w:ascii="Arial" w:eastAsia="Arial" w:hAnsi="Arial" w:cs="Arial"/>
-                      <w:color w:val="000000"/>
-                      <w:sz w:val="20"/>
-                      <w:szCs w:val="20"/>
-                    </w:rPr>
-                    <w:t>Total</w:t>
                   </w:r>
                 </w:p>
               </w:tc>
@@ -8215,7 +7964,7 @@
               </w:trPr>
               <w:tc>
                 <w:tcPr>
-                  <w:tcW w:w="1193" w:type="dxa"/>
+                  <w:tcW w:w="2067" w:type="dxa"/>
                   <w:tcBorders>
                     <w:top w:val="none" w:sz="0" w:space="0" w:color="FFFFFF"/>
                     <w:left w:val="none" w:sz="0" w:space="0" w:color="FFFFFF"/>
@@ -8256,52 +8005,6 @@
                       <w:szCs w:val="20"/>
                     </w:rPr>
                     <w:t>Returns / Spawner</w:t>
-                  </w:r>
-                </w:p>
-              </w:tc>
-              <w:tc>
-                <w:tcPr>
-                  <w:tcW w:w="1003" w:type="dxa"/>
-                  <w:tcBorders>
-                    <w:top w:val="none" w:sz="0" w:space="0" w:color="FFFFFF"/>
-                    <w:left w:val="none" w:sz="0" w:space="0" w:color="FFFFFF"/>
-                    <w:bottom w:val="none" w:sz="0" w:space="0" w:color="FFFFFF"/>
-                    <w:right w:val="none" w:sz="0" w:space="0" w:color="FFFFFF"/>
-                  </w:tcBorders>
-                  <w:shd w:val="clear" w:color="auto" w:fill="FFFFFF"/>
-                  <w:tcMar>
-                    <w:top w:w="0" w:type="dxa"/>
-                    <w:left w:w="0" w:type="dxa"/>
-                    <w:bottom w:w="0" w:type="dxa"/>
-                    <w:right w:w="0" w:type="dxa"/>
-                  </w:tcMar>
-                  <w:vAlign w:val="center"/>
-                </w:tcPr>
-                <w:p>
-                  <w:pPr>
-                    <w:pBdr>
-                      <w:top w:val="none" w:sz="0" w:space="0" w:color="000000"/>
-                      <w:left w:val="none" w:sz="0" w:space="0" w:color="000000"/>
-                      <w:bottom w:val="none" w:sz="0" w:space="0" w:color="000000"/>
-                      <w:right w:val="none" w:sz="0" w:space="0" w:color="000000"/>
-                    </w:pBdr>
-                    <w:spacing w:before="20" w:after="20"/>
-                    <w:ind w:left="100" w:right="100"/>
-                    <w:rPr>
-                      <w:rFonts w:ascii="Arial" w:eastAsia="Arial" w:hAnsi="Arial" w:cs="Arial"/>
-                      <w:color w:val="000000"/>
-                      <w:sz w:val="20"/>
-                      <w:szCs w:val="20"/>
-                    </w:rPr>
-                  </w:pPr>
-                  <w:r>
-                    <w:rPr>
-                      <w:rFonts w:ascii="Arial" w:eastAsia="Arial" w:hAnsi="Arial" w:cs="Arial"/>
-                      <w:color w:val="000000"/>
-                      <w:sz w:val="20"/>
-                      <w:szCs w:val="20"/>
-                    </w:rPr>
-                    <w:t>Total</w:t>
                   </w:r>
                 </w:p>
               </w:tc>
@@ -8588,7 +8291,7 @@
               </w:trPr>
               <w:tc>
                 <w:tcPr>
-                  <w:tcW w:w="1193" w:type="dxa"/>
+                  <w:tcW w:w="2067" w:type="dxa"/>
                   <w:tcBorders>
                     <w:top w:val="none" w:sz="0" w:space="0" w:color="FFFFFF"/>
                     <w:left w:val="none" w:sz="0" w:space="0" w:color="FFFFFF"/>
@@ -8629,52 +8332,6 @@
                       <w:szCs w:val="20"/>
                     </w:rPr>
                     <w:t>Returns / Spawner</w:t>
-                  </w:r>
-                </w:p>
-              </w:tc>
-              <w:tc>
-                <w:tcPr>
-                  <w:tcW w:w="1003" w:type="dxa"/>
-                  <w:tcBorders>
-                    <w:top w:val="none" w:sz="0" w:space="0" w:color="FFFFFF"/>
-                    <w:left w:val="none" w:sz="0" w:space="0" w:color="FFFFFF"/>
-                    <w:bottom w:val="none" w:sz="0" w:space="0" w:color="FFFFFF"/>
-                    <w:right w:val="none" w:sz="0" w:space="0" w:color="FFFFFF"/>
-                  </w:tcBorders>
-                  <w:shd w:val="clear" w:color="auto" w:fill="FFFFFF"/>
-                  <w:tcMar>
-                    <w:top w:w="0" w:type="dxa"/>
-                    <w:left w:w="0" w:type="dxa"/>
-                    <w:bottom w:w="0" w:type="dxa"/>
-                    <w:right w:w="0" w:type="dxa"/>
-                  </w:tcMar>
-                  <w:vAlign w:val="center"/>
-                </w:tcPr>
-                <w:p>
-                  <w:pPr>
-                    <w:pBdr>
-                      <w:top w:val="none" w:sz="0" w:space="0" w:color="000000"/>
-                      <w:left w:val="none" w:sz="0" w:space="0" w:color="000000"/>
-                      <w:bottom w:val="none" w:sz="0" w:space="0" w:color="000000"/>
-                      <w:right w:val="none" w:sz="0" w:space="0" w:color="000000"/>
-                    </w:pBdr>
-                    <w:spacing w:before="20" w:after="20"/>
-                    <w:ind w:left="100" w:right="100"/>
-                    <w:rPr>
-                      <w:rFonts w:ascii="Arial" w:eastAsia="Arial" w:hAnsi="Arial" w:cs="Arial"/>
-                      <w:color w:val="000000"/>
-                      <w:sz w:val="20"/>
-                      <w:szCs w:val="20"/>
-                    </w:rPr>
-                  </w:pPr>
-                  <w:r>
-                    <w:rPr>
-                      <w:rFonts w:ascii="Arial" w:eastAsia="Arial" w:hAnsi="Arial" w:cs="Arial"/>
-                      <w:color w:val="000000"/>
-                      <w:sz w:val="20"/>
-                      <w:szCs w:val="20"/>
-                    </w:rPr>
-                    <w:t>Total</w:t>
                   </w:r>
                 </w:p>
               </w:tc>
@@ -9612,7 +9269,7 @@
   <w:abstractNum w:abstractNumId="0" w15:restartNumberingAfterBreak="0">
     <w:nsid w:val="0000A990"/>
     <w:multiLevelType w:val="multilevel"/>
-    <w:tmpl w:val="8F2CF834"/>
+    <w:tmpl w:val="13C6F43C"/>
     <w:lvl w:ilvl="0">
       <w:numFmt w:val="bullet"/>
       <w:lvlText w:val=" "/>
@@ -9689,7 +9346,7 @@
   <w:abstractNum w:abstractNumId="1" w15:restartNumberingAfterBreak="0">
     <w:nsid w:val="0000A991"/>
     <w:multiLevelType w:val="multilevel"/>
-    <w:tmpl w:val="BE900ABE"/>
+    <w:tmpl w:val="BC489096"/>
     <w:lvl w:ilvl="0">
       <w:numFmt w:val="bullet"/>
       <w:lvlText w:val=""/>
@@ -9793,14 +9450,14 @@
   <w:abstractNum w:abstractNumId="2" w15:restartNumberingAfterBreak="0">
     <w:nsid w:val="00A99411"/>
     <w:multiLevelType w:val="multilevel"/>
-    <w:tmpl w:val="327AFEC0"/>
+    <w:tmpl w:val="10C6F39C"/>
     <w:lvl w:ilvl="0">
       <w:start w:val="1"/>
       <w:numFmt w:val="decimal"/>
       <w:lvlText w:val="%1."/>
       <w:lvlJc w:val="left"/>
       <w:pPr>
-        <w:ind w:left="720" w:hanging="360"/>
+        <w:ind w:left="360" w:hanging="360"/>
       </w:pPr>
     </w:lvl>
     <w:lvl w:ilvl="1">
@@ -9809,7 +9466,7 @@
       <w:lvlText w:val="%2."/>
       <w:lvlJc w:val="left"/>
       <w:pPr>
-        <w:ind w:left="1440" w:hanging="360"/>
+        <w:ind w:left="1080" w:hanging="360"/>
       </w:pPr>
     </w:lvl>
     <w:lvl w:ilvl="2">
@@ -9818,7 +9475,7 @@
       <w:lvlText w:val="%3."/>
       <w:lvlJc w:val="left"/>
       <w:pPr>
-        <w:ind w:left="2160" w:hanging="360"/>
+        <w:ind w:left="1800" w:hanging="360"/>
       </w:pPr>
     </w:lvl>
     <w:lvl w:ilvl="3">
@@ -9827,7 +9484,7 @@
       <w:lvlText w:val="%4."/>
       <w:lvlJc w:val="left"/>
       <w:pPr>
-        <w:ind w:left="2880" w:hanging="360"/>
+        <w:ind w:left="2520" w:hanging="360"/>
       </w:pPr>
     </w:lvl>
     <w:lvl w:ilvl="4">
@@ -9836,7 +9493,7 @@
       <w:lvlText w:val="%5."/>
       <w:lvlJc w:val="left"/>
       <w:pPr>
-        <w:ind w:left="3600" w:hanging="360"/>
+        <w:ind w:left="3240" w:hanging="360"/>
       </w:pPr>
     </w:lvl>
     <w:lvl w:ilvl="5">
@@ -9845,7 +9502,7 @@
       <w:lvlText w:val="%6."/>
       <w:lvlJc w:val="left"/>
       <w:pPr>
-        <w:ind w:left="4320" w:hanging="360"/>
+        <w:ind w:left="3960" w:hanging="360"/>
       </w:pPr>
     </w:lvl>
     <w:lvl w:ilvl="6">
@@ -9854,7 +9511,7 @@
       <w:lvlText w:val="%7."/>
       <w:lvlJc w:val="left"/>
       <w:pPr>
-        <w:ind w:left="5040" w:hanging="360"/>
+        <w:ind w:left="4680" w:hanging="360"/>
       </w:pPr>
     </w:lvl>
     <w:lvl w:ilvl="7">
@@ -9863,7 +9520,7 @@
       <w:lvlText w:val="%8."/>
       <w:lvlJc w:val="left"/>
       <w:pPr>
-        <w:ind w:left="5760" w:hanging="360"/>
+        <w:ind w:left="5400" w:hanging="360"/>
       </w:pPr>
     </w:lvl>
     <w:lvl w:ilvl="8">
@@ -9872,21 +9529,21 @@
       <w:lvlText w:val="%9."/>
       <w:lvlJc w:val="left"/>
       <w:pPr>
-        <w:ind w:left="6480" w:hanging="360"/>
+        <w:ind w:left="6120" w:hanging="360"/>
       </w:pPr>
     </w:lvl>
   </w:abstractNum>
   <w:abstractNum w:abstractNumId="3" w15:restartNumberingAfterBreak="0">
     <w:nsid w:val="00A99412"/>
     <w:multiLevelType w:val="multilevel"/>
-    <w:tmpl w:val="3C3E67A6"/>
+    <w:tmpl w:val="950C52CA"/>
     <w:lvl w:ilvl="0">
       <w:start w:val="2"/>
       <w:numFmt w:val="decimal"/>
       <w:lvlText w:val="%1."/>
       <w:lvlJc w:val="left"/>
       <w:pPr>
-        <w:ind w:left="720" w:hanging="360"/>
+        <w:ind w:left="360" w:hanging="360"/>
       </w:pPr>
     </w:lvl>
     <w:lvl w:ilvl="1">
@@ -9895,7 +9552,7 @@
       <w:lvlText w:val="%2."/>
       <w:lvlJc w:val="left"/>
       <w:pPr>
-        <w:ind w:left="1440" w:hanging="360"/>
+        <w:ind w:left="1080" w:hanging="360"/>
       </w:pPr>
     </w:lvl>
     <w:lvl w:ilvl="2">
@@ -9904,7 +9561,7 @@
       <w:lvlText w:val="%3."/>
       <w:lvlJc w:val="left"/>
       <w:pPr>
-        <w:ind w:left="2160" w:hanging="360"/>
+        <w:ind w:left="1800" w:hanging="360"/>
       </w:pPr>
     </w:lvl>
     <w:lvl w:ilvl="3">
@@ -9913,7 +9570,7 @@
       <w:lvlText w:val="%4."/>
       <w:lvlJc w:val="left"/>
       <w:pPr>
-        <w:ind w:left="2880" w:hanging="360"/>
+        <w:ind w:left="2520" w:hanging="360"/>
       </w:pPr>
     </w:lvl>
     <w:lvl w:ilvl="4">
@@ -9922,7 +9579,7 @@
       <w:lvlText w:val="%5."/>
       <w:lvlJc w:val="left"/>
       <w:pPr>
-        <w:ind w:left="3600" w:hanging="360"/>
+        <w:ind w:left="3240" w:hanging="360"/>
       </w:pPr>
     </w:lvl>
     <w:lvl w:ilvl="5">
@@ -9931,7 +9588,7 @@
       <w:lvlText w:val="%6."/>
       <w:lvlJc w:val="left"/>
       <w:pPr>
-        <w:ind w:left="4320" w:hanging="360"/>
+        <w:ind w:left="3960" w:hanging="360"/>
       </w:pPr>
     </w:lvl>
     <w:lvl w:ilvl="6">
@@ -9940,7 +9597,7 @@
       <w:lvlText w:val="%7."/>
       <w:lvlJc w:val="left"/>
       <w:pPr>
-        <w:ind w:left="5040" w:hanging="360"/>
+        <w:ind w:left="4680" w:hanging="360"/>
       </w:pPr>
     </w:lvl>
     <w:lvl w:ilvl="7">
@@ -9949,7 +9606,7 @@
       <w:lvlText w:val="%8."/>
       <w:lvlJc w:val="left"/>
       <w:pPr>
-        <w:ind w:left="5760" w:hanging="360"/>
+        <w:ind w:left="5400" w:hanging="360"/>
       </w:pPr>
     </w:lvl>
     <w:lvl w:ilvl="8">
@@ -9958,14 +9615,14 @@
       <w:lvlText w:val="%9."/>
       <w:lvlJc w:val="left"/>
       <w:pPr>
-        <w:ind w:left="6480" w:hanging="360"/>
+        <w:ind w:left="6120" w:hanging="360"/>
       </w:pPr>
     </w:lvl>
   </w:abstractNum>
-  <w:num w:numId="1" w16cid:durableId="422529720">
+  <w:num w:numId="1" w16cid:durableId="1350255389">
     <w:abstractNumId w:val="0"/>
   </w:num>
-  <w:num w:numId="2" w16cid:durableId="1807812245">
+  <w:num w:numId="2" w16cid:durableId="1224023288">
     <w:abstractNumId w:val="2"/>
     <w:lvlOverride w:ilvl="0">
       <w:startOverride w:val="1"/>
@@ -9995,10 +9652,10 @@
       <w:startOverride w:val="1"/>
     </w:lvlOverride>
   </w:num>
-  <w:num w:numId="3" w16cid:durableId="834493247">
+  <w:num w:numId="3" w16cid:durableId="1100027934">
     <w:abstractNumId w:val="1"/>
   </w:num>
-  <w:num w:numId="4" w16cid:durableId="644316236">
+  <w:num w:numId="4" w16cid:durableId="502933870">
     <w:abstractNumId w:val="3"/>
     <w:lvlOverride w:ilvl="0">
       <w:startOverride w:val="2"/>
@@ -10028,7 +9685,7 @@
       <w:startOverride w:val="2"/>
     </w:lvlOverride>
   </w:num>
-  <w:num w:numId="5" w16cid:durableId="2011787674">
+  <w:num w:numId="5" w16cid:durableId="347365302">
     <w:abstractNumId w:val="1"/>
   </w:num>
 </w:numbering>
@@ -10039,10 +9696,10 @@
   <w:docDefaults>
     <w:rPrDefault>
       <w:rPr>
-        <w:rFonts w:asciiTheme="minorHAnsi" w:eastAsiaTheme="minorHAnsi" w:hAnsiTheme="minorHAnsi" w:cstheme="minorBidi"/>
+        <w:rFonts w:asciiTheme="minorHAnsi" w:eastAsiaTheme="minorEastAsia" w:hAnsiTheme="minorHAnsi" w:cstheme="minorBidi"/>
         <w:sz w:val="24"/>
         <w:szCs w:val="24"/>
-        <w:lang w:val="en-US" w:eastAsia="en-US" w:bidi="ar-SA"/>
+        <w:lang w:val="en-US" w:eastAsia="zh-CN" w:bidi="ar-SA"/>
       </w:rPr>
     </w:rPrDefault>
     <w:pPrDefault>
@@ -10841,12 +10498,7 @@
       </w:tblCellMar>
     </w:tblPr>
     <w:tblStylePr w:type="firstRow">
-      <w:tblPr>
-        <w:jc w:val="left"/>
-      </w:tblPr>
-      <w:trPr>
-        <w:jc w:val="left"/>
-      </w:trPr>
+      <w:tblPr/>
       <w:tcPr>
         <w:tcBorders>
           <w:bottom w:val="single" w:sz="0" w:space="0" w:color="auto"/>
@@ -11571,322 +11223,8 @@
 </a:theme>
 </file>
 
-<file path=customXml/item1.xml><?xml version="1.0" encoding="utf-8"?>
-<ct:contentTypeSchema xmlns:ct="http://schemas.microsoft.com/office/2006/metadata/contentType" xmlns:ma="http://schemas.microsoft.com/office/2006/metadata/properties/metaAttributes" ct:_="" ma:_="" ma:contentTypeName="Document" ma:contentTypeID="0x010100EC7596F46FBD854C8DC3F3B085BBCAC1" ma:contentTypeVersion="18" ma:contentTypeDescription="Create a new document." ma:contentTypeScope="" ma:versionID="fdaf71e347e2c07225aa1e66414133d5">
-  <xsd:schema xmlns:xsd="http://www.w3.org/2001/XMLSchema" xmlns:xs="http://www.w3.org/2001/XMLSchema" xmlns:p="http://schemas.microsoft.com/office/2006/metadata/properties" xmlns:ns1="http://schemas.microsoft.com/sharepoint/v3" xmlns:ns3="a4575e22-d889-4f39-9409-ff63cab842ee" xmlns:ns4="42f805d6-ad7d-4cce-adcc-9f71a505a6ab" targetNamespace="http://schemas.microsoft.com/office/2006/metadata/properties" ma:root="true" ma:fieldsID="4fe0243b2ed4e4132e49f3a149b0b499" ns1:_="" ns3:_="" ns4:_="">
-    <xsd:import namespace="http://schemas.microsoft.com/sharepoint/v3"/>
-    <xsd:import namespace="a4575e22-d889-4f39-9409-ff63cab842ee"/>
-    <xsd:import namespace="42f805d6-ad7d-4cce-adcc-9f71a505a6ab"/>
-    <xsd:element name="properties">
-      <xsd:complexType>
-        <xsd:sequence>
-          <xsd:element name="documentManagement">
-            <xsd:complexType>
-              <xsd:all>
-                <xsd:element ref="ns3:SharedWithUsers" minOccurs="0"/>
-                <xsd:element ref="ns3:SharedWithDetails" minOccurs="0"/>
-                <xsd:element ref="ns3:SharingHintHash" minOccurs="0"/>
-                <xsd:element ref="ns1:_ip_UnifiedCompliancePolicyProperties" minOccurs="0"/>
-                <xsd:element ref="ns1:_ip_UnifiedCompliancePolicyUIAction" minOccurs="0"/>
-                <xsd:element ref="ns4:MediaServiceMetadata" minOccurs="0"/>
-                <xsd:element ref="ns4:MediaServiceFastMetadata" minOccurs="0"/>
-                <xsd:element ref="ns4:MediaServiceAutoTags" minOccurs="0"/>
-                <xsd:element ref="ns4:MediaServiceOCR" minOccurs="0"/>
-                <xsd:element ref="ns4:MediaServiceGenerationTime" minOccurs="0"/>
-                <xsd:element ref="ns4:MediaServiceEventHashCode" minOccurs="0"/>
-                <xsd:element ref="ns4:MediaServiceDateTaken" minOccurs="0"/>
-                <xsd:element ref="ns4:MediaServiceLocation" minOccurs="0"/>
-                <xsd:element ref="ns4:MediaLengthInSeconds" minOccurs="0"/>
-                <xsd:element ref="ns4:_activity" minOccurs="0"/>
-                <xsd:element ref="ns4:MediaServiceObjectDetectorVersions" minOccurs="0"/>
-                <xsd:element ref="ns4:MediaServiceSystemTags" minOccurs="0"/>
-                <xsd:element ref="ns4:MediaServiceSearchProperties" minOccurs="0"/>
-              </xsd:all>
-            </xsd:complexType>
-          </xsd:element>
-        </xsd:sequence>
-      </xsd:complexType>
-    </xsd:element>
-  </xsd:schema>
-  <xsd:schema xmlns:xsd="http://www.w3.org/2001/XMLSchema" xmlns:xs="http://www.w3.org/2001/XMLSchema" xmlns:dms="http://schemas.microsoft.com/office/2006/documentManagement/types" xmlns:pc="http://schemas.microsoft.com/office/infopath/2007/PartnerControls" targetNamespace="http://schemas.microsoft.com/sharepoint/v3" elementFormDefault="qualified">
-    <xsd:import namespace="http://schemas.microsoft.com/office/2006/documentManagement/types"/>
-    <xsd:import namespace="http://schemas.microsoft.com/office/infopath/2007/PartnerControls"/>
-    <xsd:element name="_ip_UnifiedCompliancePolicyProperties" ma:index="11" nillable="true" ma:displayName="Unified Compliance Policy Properties" ma:hidden="true" ma:internalName="_ip_UnifiedCompliancePolicyProperties">
-      <xsd:simpleType>
-        <xsd:restriction base="dms:Note"/>
-      </xsd:simpleType>
-    </xsd:element>
-    <xsd:element name="_ip_UnifiedCompliancePolicyUIAction" ma:index="12" nillable="true" ma:displayName="Unified Compliance Policy UI Action" ma:hidden="true" ma:internalName="_ip_UnifiedCompliancePolicyUIAction">
-      <xsd:simpleType>
-        <xsd:restriction base="dms:Text"/>
-      </xsd:simpleType>
-    </xsd:element>
-  </xsd:schema>
-  <xsd:schema xmlns:xsd="http://www.w3.org/2001/XMLSchema" xmlns:xs="http://www.w3.org/2001/XMLSchema" xmlns:dms="http://schemas.microsoft.com/office/2006/documentManagement/types" xmlns:pc="http://schemas.microsoft.com/office/infopath/2007/PartnerControls" targetNamespace="a4575e22-d889-4f39-9409-ff63cab842ee" elementFormDefault="qualified">
-    <xsd:import namespace="http://schemas.microsoft.com/office/2006/documentManagement/types"/>
-    <xsd:import namespace="http://schemas.microsoft.com/office/infopath/2007/PartnerControls"/>
-    <xsd:element name="SharedWithUsers" ma:index="8" nillable="true" ma:displayName="Shared With" ma:internalName="SharedWithUsers" ma:readOnly="true">
-      <xsd:complexType>
-        <xsd:complexContent>
-          <xsd:extension base="dms:UserMulti">
-            <xsd:sequence>
-              <xsd:element name="UserInfo" minOccurs="0" maxOccurs="unbounded">
-                <xsd:complexType>
-                  <xsd:sequence>
-                    <xsd:element name="DisplayName" type="xsd:string" minOccurs="0"/>
-                    <xsd:element name="AccountId" type="dms:UserId" minOccurs="0" nillable="true"/>
-                    <xsd:element name="AccountType" type="xsd:string" minOccurs="0"/>
-                  </xsd:sequence>
-                </xsd:complexType>
-              </xsd:element>
-            </xsd:sequence>
-          </xsd:extension>
-        </xsd:complexContent>
-      </xsd:complexType>
-    </xsd:element>
-    <xsd:element name="SharedWithDetails" ma:index="9" nillable="true" ma:displayName="Shared With Details" ma:internalName="SharedWithDetails" ma:readOnly="true">
-      <xsd:simpleType>
-        <xsd:restriction base="dms:Note">
-          <xsd:maxLength value="255"/>
-        </xsd:restriction>
-      </xsd:simpleType>
-    </xsd:element>
-    <xsd:element name="SharingHintHash" ma:index="10" nillable="true" ma:displayName="Sharing Hint Hash" ma:hidden="true" ma:internalName="SharingHintHash" ma:readOnly="true">
-      <xsd:simpleType>
-        <xsd:restriction base="dms:Text"/>
-      </xsd:simpleType>
-    </xsd:element>
-  </xsd:schema>
-  <xsd:schema xmlns:xsd="http://www.w3.org/2001/XMLSchema" xmlns:xs="http://www.w3.org/2001/XMLSchema" xmlns:dms="http://schemas.microsoft.com/office/2006/documentManagement/types" xmlns:pc="http://schemas.microsoft.com/office/infopath/2007/PartnerControls" targetNamespace="42f805d6-ad7d-4cce-adcc-9f71a505a6ab" elementFormDefault="qualified">
-    <xsd:import namespace="http://schemas.microsoft.com/office/2006/documentManagement/types"/>
-    <xsd:import namespace="http://schemas.microsoft.com/office/infopath/2007/PartnerControls"/>
-    <xsd:element name="MediaServiceMetadata" ma:index="13" nillable="true" ma:displayName="MediaServiceMetadata" ma:hidden="true" ma:internalName="MediaServiceMetadata" ma:readOnly="true">
-      <xsd:simpleType>
-        <xsd:restriction base="dms:Note"/>
-      </xsd:simpleType>
-    </xsd:element>
-    <xsd:element name="MediaServiceFastMetadata" ma:index="14" nillable="true" ma:displayName="MediaServiceFastMetadata" ma:hidden="true" ma:internalName="MediaServiceFastMetadata" ma:readOnly="true">
-      <xsd:simpleType>
-        <xsd:restriction base="dms:Note"/>
-      </xsd:simpleType>
-    </xsd:element>
-    <xsd:element name="MediaServiceAutoTags" ma:index="15" nillable="true" ma:displayName="Tags" ma:internalName="MediaServiceAutoTags" ma:readOnly="true">
-      <xsd:simpleType>
-        <xsd:restriction base="dms:Text"/>
-      </xsd:simpleType>
-    </xsd:element>
-    <xsd:element name="MediaServiceOCR" ma:index="16" nillable="true" ma:displayName="Extracted Text" ma:internalName="MediaServiceOCR" ma:readOnly="true">
-      <xsd:simpleType>
-        <xsd:restriction base="dms:Note">
-          <xsd:maxLength value="255"/>
-        </xsd:restriction>
-      </xsd:simpleType>
-    </xsd:element>
-    <xsd:element name="MediaServiceGenerationTime" ma:index="17" nillable="true" ma:displayName="MediaServiceGenerationTime" ma:hidden="true" ma:internalName="MediaServiceGenerationTime" ma:readOnly="true">
-      <xsd:simpleType>
-        <xsd:restriction base="dms:Text"/>
-      </xsd:simpleType>
-    </xsd:element>
-    <xsd:element name="MediaServiceEventHashCode" ma:index="18" nillable="true" ma:displayName="MediaServiceEventHashCode" ma:hidden="true" ma:internalName="MediaServiceEventHashCode" ma:readOnly="true">
-      <xsd:simpleType>
-        <xsd:restriction base="dms:Text"/>
-      </xsd:simpleType>
-    </xsd:element>
-    <xsd:element name="MediaServiceDateTaken" ma:index="19" nillable="true" ma:displayName="MediaServiceDateTaken" ma:hidden="true" ma:internalName="MediaServiceDateTaken" ma:readOnly="true">
-      <xsd:simpleType>
-        <xsd:restriction base="dms:Text"/>
-      </xsd:simpleType>
-    </xsd:element>
-    <xsd:element name="MediaServiceLocation" ma:index="20" nillable="true" ma:displayName="Location" ma:internalName="MediaServiceLocation" ma:readOnly="true">
-      <xsd:simpleType>
-        <xsd:restriction base="dms:Text"/>
-      </xsd:simpleType>
-    </xsd:element>
-    <xsd:element name="MediaLengthInSeconds" ma:index="21" nillable="true" ma:displayName="MediaLengthInSeconds" ma:hidden="true" ma:internalName="MediaLengthInSeconds" ma:readOnly="true">
-      <xsd:simpleType>
-        <xsd:restriction base="dms:Unknown"/>
-      </xsd:simpleType>
-    </xsd:element>
-    <xsd:element name="_activity" ma:index="22" nillable="true" ma:displayName="_activity" ma:hidden="true" ma:internalName="_activity">
-      <xsd:simpleType>
-        <xsd:restriction base="dms:Note"/>
-      </xsd:simpleType>
-    </xsd:element>
-    <xsd:element name="MediaServiceObjectDetectorVersions" ma:index="23" nillable="true" ma:displayName="MediaServiceObjectDetectorVersions" ma:description="" ma:hidden="true" ma:indexed="true" ma:internalName="MediaServiceObjectDetectorVersions" ma:readOnly="true">
-      <xsd:simpleType>
-        <xsd:restriction base="dms:Text"/>
-      </xsd:simpleType>
-    </xsd:element>
-    <xsd:element name="MediaServiceSystemTags" ma:index="24" nillable="true" ma:displayName="MediaServiceSystemTags" ma:hidden="true" ma:internalName="MediaServiceSystemTags" ma:readOnly="true">
-      <xsd:simpleType>
-        <xsd:restriction base="dms:Note"/>
-      </xsd:simpleType>
-    </xsd:element>
-    <xsd:element name="MediaServiceSearchProperties" ma:index="25" nillable="true" ma:displayName="MediaServiceSearchProperties" ma:hidden="true" ma:internalName="MediaServiceSearchProperties" ma:readOnly="true">
-      <xsd:simpleType>
-        <xsd:restriction base="dms:Note"/>
-      </xsd:simpleType>
-    </xsd:element>
-  </xsd:schema>
-  <xsd:schema xmlns="http://schemas.openxmlformats.org/package/2006/metadata/core-properties" xmlns:xsd="http://www.w3.org/2001/XMLSchema" xmlns:xsi="http://www.w3.org/2001/XMLSchema-instance" xmlns:dc="http://purl.org/dc/elements/1.1/" xmlns:dcterms="http://purl.org/dc/terms/" xmlns:odoc="http://schemas.microsoft.com/internal/obd" targetNamespace="http://schemas.openxmlformats.org/package/2006/metadata/core-properties" elementFormDefault="qualified" attributeFormDefault="unqualified" blockDefault="#all">
-    <xsd:import namespace="http://purl.org/dc/elements/1.1/" schemaLocation="http://dublincore.org/schemas/xmls/qdc/2003/04/02/dc.xsd"/>
-    <xsd:import namespace="http://purl.org/dc/terms/" schemaLocation="http://dublincore.org/schemas/xmls/qdc/2003/04/02/dcterms.xsd"/>
-    <xsd:element name="coreProperties" type="CT_coreProperties"/>
-    <xsd:complexType name="CT_coreProperties">
-      <xsd:all>
-        <xsd:element ref="dc:creator" minOccurs="0" maxOccurs="1"/>
-        <xsd:element ref="dcterms:created" minOccurs="0" maxOccurs="1"/>
-        <xsd:element ref="dc:identifier" minOccurs="0" maxOccurs="1"/>
-        <xsd:element name="contentType" minOccurs="0" maxOccurs="1" type="xsd:string" ma:index="0" ma:displayName="Content Type"/>
-        <xsd:element ref="dc:title" minOccurs="0" maxOccurs="1" ma:index="4" ma:displayName="Title"/>
-        <xsd:element ref="dc:subject" minOccurs="0" maxOccurs="1"/>
-        <xsd:element ref="dc:description" minOccurs="0" maxOccurs="1"/>
-        <xsd:element name="keywords" minOccurs="0" maxOccurs="1" type="xsd:string"/>
-        <xsd:element ref="dc:language" minOccurs="0" maxOccurs="1"/>
-        <xsd:element name="category" minOccurs="0" maxOccurs="1" type="xsd:string"/>
-        <xsd:element name="version" minOccurs="0" maxOccurs="1" type="xsd:string"/>
-        <xsd:element name="revision" minOccurs="0" maxOccurs="1" type="xsd:string">
-          <xsd:annotation>
-            <xsd:documentation>
-                        This value indicates the number of saves or revisions. The application is responsible for updating this value after each revision.
-                    </xsd:documentation>
-          </xsd:annotation>
-        </xsd:element>
-        <xsd:element name="lastModifiedBy" minOccurs="0" maxOccurs="1" type="xsd:string"/>
-        <xsd:element ref="dcterms:modified" minOccurs="0" maxOccurs="1"/>
-        <xsd:element name="contentStatus" minOccurs="0" maxOccurs="1" type="xsd:string"/>
-      </xsd:all>
-    </xsd:complexType>
-  </xsd:schema>
-  <xs:schema xmlns:pc="http://schemas.microsoft.com/office/infopath/2007/PartnerControls" xmlns:xs="http://www.w3.org/2001/XMLSchema" targetNamespace="http://schemas.microsoft.com/office/infopath/2007/PartnerControls" elementFormDefault="qualified" attributeFormDefault="unqualified">
-    <xs:element name="Person">
-      <xs:complexType>
-        <xs:sequence>
-          <xs:element ref="pc:DisplayName" minOccurs="0"/>
-          <xs:element ref="pc:AccountId" minOccurs="0"/>
-          <xs:element ref="pc:AccountType" minOccurs="0"/>
-        </xs:sequence>
-      </xs:complexType>
-    </xs:element>
-    <xs:element name="DisplayName" type="xs:string"/>
-    <xs:element name="AccountId" type="xs:string"/>
-    <xs:element name="AccountType" type="xs:string"/>
-    <xs:element name="BDCAssociatedEntity">
-      <xs:complexType>
-        <xs:sequence>
-          <xs:element ref="pc:BDCEntity" minOccurs="0" maxOccurs="unbounded"/>
-        </xs:sequence>
-        <xs:attribute ref="pc:EntityNamespace"/>
-        <xs:attribute ref="pc:EntityName"/>
-        <xs:attribute ref="pc:SystemInstanceName"/>
-        <xs:attribute ref="pc:AssociationName"/>
-      </xs:complexType>
-    </xs:element>
-    <xs:attribute name="EntityNamespace" type="xs:string"/>
-    <xs:attribute name="EntityName" type="xs:string"/>
-    <xs:attribute name="SystemInstanceName" type="xs:string"/>
-    <xs:attribute name="AssociationName" type="xs:string"/>
-    <xs:element name="BDCEntity">
-      <xs:complexType>
-        <xs:sequence>
-          <xs:element ref="pc:EntityDisplayName" minOccurs="0"/>
-          <xs:element ref="pc:EntityInstanceReference" minOccurs="0"/>
-          <xs:element ref="pc:EntityId1" minOccurs="0"/>
-          <xs:element ref="pc:EntityId2" minOccurs="0"/>
-          <xs:element ref="pc:EntityId3" minOccurs="0"/>
-          <xs:element ref="pc:EntityId4" minOccurs="0"/>
-          <xs:element ref="pc:EntityId5" minOccurs="0"/>
-        </xs:sequence>
-      </xs:complexType>
-    </xs:element>
-    <xs:element name="EntityDisplayName" type="xs:string"/>
-    <xs:element name="EntityInstanceReference" type="xs:string"/>
-    <xs:element name="EntityId1" type="xs:string"/>
-    <xs:element name="EntityId2" type="xs:string"/>
-    <xs:element name="EntityId3" type="xs:string"/>
-    <xs:element name="EntityId4" type="xs:string"/>
-    <xs:element name="EntityId5" type="xs:string"/>
-    <xs:element name="Terms">
-      <xs:complexType>
-        <xs:sequence>
-          <xs:element ref="pc:TermInfo" minOccurs="0" maxOccurs="unbounded"/>
-        </xs:sequence>
-      </xs:complexType>
-    </xs:element>
-    <xs:element name="TermInfo">
-      <xs:complexType>
-        <xs:sequence>
-          <xs:element ref="pc:TermName" minOccurs="0"/>
-          <xs:element ref="pc:TermId" minOccurs="0"/>
-        </xs:sequence>
-      </xs:complexType>
-    </xs:element>
-    <xs:element name="TermName" type="xs:string"/>
-    <xs:element name="TermId" type="xs:string"/>
-  </xs:schema>
-</ct:contentTypeSchema>
-</file>
-
-<file path=customXml/item2.xml><?xml version="1.0" encoding="utf-8"?>
-<?mso-contentType ?>
-<FormTemplates xmlns="http://schemas.microsoft.com/sharepoint/v3/contenttype/forms">
-  <Display>DocumentLibraryForm</Display>
-  <Edit>DocumentLibraryForm</Edit>
-  <New>DocumentLibraryForm</New>
-</FormTemplates>
-</file>
-
-<file path=customXml/item3.xml><?xml version="1.0" encoding="utf-8"?>
-<p:properties xmlns:p="http://schemas.microsoft.com/office/2006/metadata/properties" xmlns:xsi="http://www.w3.org/2001/XMLSchema-instance" xmlns:pc="http://schemas.microsoft.com/office/infopath/2007/PartnerControls">
-  <documentManagement>
-    <_ip_UnifiedCompliancePolicyUIAction xmlns="http://schemas.microsoft.com/sharepoint/v3" xsi:nil="true"/>
-    <_activity xmlns="42f805d6-ad7d-4cce-adcc-9f71a505a6ab" xsi:nil="true"/>
-    <_ip_UnifiedCompliancePolicyProperties xmlns="http://schemas.microsoft.com/sharepoint/v3" xsi:nil="true"/>
-  </documentManagement>
-</p:properties>
-</file>
-
-<file path=customXml/itemProps1.xml><?xml version="1.0" encoding="utf-8"?>
-<ds:datastoreItem xmlns:ds="http://schemas.openxmlformats.org/officeDocument/2006/customXml" ds:itemID="{9F0928D1-B825-44E9-B8C2-D2030BF4C418}">
-  <ds:schemaRefs>
-    <ds:schemaRef ds:uri="http://schemas.microsoft.com/office/2006/metadata/contentType"/>
-    <ds:schemaRef ds:uri="http://schemas.microsoft.com/office/2006/metadata/properties/metaAttributes"/>
-    <ds:schemaRef ds:uri="http://www.w3.org/2001/XMLSchema"/>
-    <ds:schemaRef ds:uri="http://schemas.microsoft.com/office/2006/metadata/properties"/>
-    <ds:schemaRef ds:uri="http://schemas.microsoft.com/sharepoint/v3"/>
-    <ds:schemaRef ds:uri="a4575e22-d889-4f39-9409-ff63cab842ee"/>
-    <ds:schemaRef ds:uri="42f805d6-ad7d-4cce-adcc-9f71a505a6ab"/>
-    <ds:schemaRef ds:uri="http://schemas.microsoft.com/office/2006/documentManagement/types"/>
-    <ds:schemaRef ds:uri="http://schemas.microsoft.com/office/infopath/2007/PartnerControls"/>
-    <ds:schemaRef ds:uri="http://schemas.openxmlformats.org/package/2006/metadata/core-properties"/>
-    <ds:schemaRef ds:uri="http://purl.org/dc/elements/1.1/"/>
-    <ds:schemaRef ds:uri="http://purl.org/dc/terms/"/>
-    <ds:schemaRef ds:uri="http://schemas.microsoft.com/internal/obd"/>
-  </ds:schemaRefs>
-</ds:datastoreItem>
-</file>
-
-<file path=customXml/itemProps2.xml><?xml version="1.0" encoding="utf-8"?>
-<ds:datastoreItem xmlns:ds="http://schemas.openxmlformats.org/officeDocument/2006/customXml" ds:itemID="{18902174-E6D4-430E-9A72-2384FAB74A35}">
-  <ds:schemaRefs>
-    <ds:schemaRef ds:uri="http://schemas.microsoft.com/sharepoint/v3/contenttype/forms"/>
-  </ds:schemaRefs>
-</ds:datastoreItem>
-</file>
-
-<file path=customXml/itemProps3.xml><?xml version="1.0" encoding="utf-8"?>
-<ds:datastoreItem xmlns:ds="http://schemas.openxmlformats.org/officeDocument/2006/customXml" ds:itemID="{F43EB117-75C0-4261-A9F6-E3D5D86864EA}">
-  <ds:schemaRefs>
-    <ds:schemaRef ds:uri="http://schemas.microsoft.com/office/2006/metadata/properties"/>
-    <ds:schemaRef ds:uri="http://schemas.microsoft.com/office/infopath/2007/PartnerControls"/>
-    <ds:schemaRef ds:uri="http://schemas.microsoft.com/sharepoint/v3"/>
-    <ds:schemaRef ds:uri="42f805d6-ad7d-4cce-adcc-9f71a505a6ab"/>
-  </ds:schemaRefs>
-</ds:datastoreItem>
-</file>
-
 <file path=docMetadata/LabelInfo.xml><?xml version="1.0" encoding="utf-8"?>
 <clbl:labelList xmlns:clbl="http://schemas.microsoft.com/office/2020/mipLabelMetadata">
-  <clbl:label id="{45011977-b912-4387-97a4-f4c94a801377}" enabled="1" method="Standard" siteId="{11d0e217-264e-400a-8ba0-57dcc127d72d}" removed="0"/>
+  <clbl:label id="{45011977-b912-4387-97a4-f4c94a801377}" enabled="1" method="Standard" siteId="{11d0e217-264e-400a-8ba0-57dcc127d72d}" contentBits="0" removed="0"/>
 </clbl:labelList>
 </file>
</xml_diff>